<commit_message>
feat(cource-work): 3 module complete
</commit_message>
<xml_diff>
--- a/course-work/docs/report/course-work.docx
+++ b/course-work/docs/report/course-work.docx
@@ -16770,6 +16770,7 @@
           <w:lang w:val="uk-UA"/>
         </w:rPr>
       </w:pPr>
+      <w:bookmarkStart w:id="15" w:name="_Hlk224775615"/>
       <w:r>
         <w:rPr>
           <w:lang w:val="uk-UA"/>
@@ -16795,6 +16796,7 @@
         <w:t>Аналіз швидкодії послідовного алгоритму</w:t>
       </w:r>
     </w:p>
+    <w:bookmarkEnd w:id="15"/>
     <w:p>
       <w:pPr>
         <w:rPr>
@@ -17081,7 +17083,14 @@
     <w:tbl>
       <w:tblPr>
         <w:tblW w:w="9639" w:type="dxa"/>
-        <w:tblCellSpacing w:w="15" w:type="dxa"/>
+        <w:tblBorders>
+          <w:top w:val="single" w:sz="4" w:space="0" w:color="auto"/>
+          <w:left w:val="single" w:sz="4" w:space="0" w:color="auto"/>
+          <w:bottom w:val="single" w:sz="4" w:space="0" w:color="auto"/>
+          <w:right w:val="single" w:sz="4" w:space="0" w:color="auto"/>
+          <w:insideH w:val="single" w:sz="4" w:space="0" w:color="auto"/>
+          <w:insideV w:val="single" w:sz="4" w:space="0" w:color="auto"/>
+        </w:tblBorders>
         <w:tblCellMar>
           <w:top w:w="15" w:type="dxa"/>
           <w:left w:w="15" w:type="dxa"/>
@@ -17091,14 +17100,13 @@
         <w:tblLook w:val="04A0" w:firstRow="1" w:lastRow="0" w:firstColumn="1" w:lastColumn="0" w:noHBand="0" w:noVBand="1"/>
       </w:tblPr>
       <w:tblGrid>
-        <w:gridCol w:w="2977"/>
-        <w:gridCol w:w="3402"/>
-        <w:gridCol w:w="3260"/>
+        <w:gridCol w:w="2968"/>
+        <w:gridCol w:w="3415"/>
+        <w:gridCol w:w="3256"/>
       </w:tblGrid>
       <w:tr>
         <w:trPr>
           <w:tblHeader/>
-          <w:tblCellSpacing w:w="15" w:type="dxa"/>
         </w:trPr>
         <w:tc>
           <w:tcPr>
@@ -17192,9 +17200,6 @@
         </w:tc>
       </w:tr>
       <w:tr>
-        <w:trPr>
-          <w:tblCellSpacing w:w="15" w:type="dxa"/>
-        </w:trPr>
         <w:tc>
           <w:tcPr>
             <w:tcW w:w="2932" w:type="dxa"/>
@@ -17275,9 +17280,6 @@
         </w:tc>
       </w:tr>
       <w:tr>
-        <w:trPr>
-          <w:tblCellSpacing w:w="15" w:type="dxa"/>
-        </w:trPr>
         <w:tc>
           <w:tcPr>
             <w:tcW w:w="2932" w:type="dxa"/>
@@ -17358,9 +17360,6 @@
         </w:tc>
       </w:tr>
       <w:tr>
-        <w:trPr>
-          <w:tblCellSpacing w:w="15" w:type="dxa"/>
-        </w:trPr>
         <w:tc>
           <w:tcPr>
             <w:tcW w:w="2932" w:type="dxa"/>
@@ -17441,9 +17440,6 @@
         </w:tc>
       </w:tr>
       <w:tr>
-        <w:trPr>
-          <w:tblCellSpacing w:w="15" w:type="dxa"/>
-        </w:trPr>
         <w:tc>
           <w:tcPr>
             <w:tcW w:w="2932" w:type="dxa"/>
@@ -17524,9 +17520,6 @@
         </w:tc>
       </w:tr>
       <w:tr>
-        <w:trPr>
-          <w:tblCellSpacing w:w="15" w:type="dxa"/>
-        </w:trPr>
         <w:tc>
           <w:tcPr>
             <w:tcW w:w="2932" w:type="dxa"/>
@@ -17607,9 +17600,6 @@
         </w:tc>
       </w:tr>
       <w:tr>
-        <w:trPr>
-          <w:tblCellSpacing w:w="15" w:type="dxa"/>
-        </w:trPr>
         <w:tc>
           <w:tcPr>
             <w:tcW w:w="2932" w:type="dxa"/>
@@ -17690,9 +17680,6 @@
         </w:tc>
       </w:tr>
       <w:tr>
-        <w:trPr>
-          <w:tblCellSpacing w:w="15" w:type="dxa"/>
-        </w:trPr>
         <w:tc>
           <w:tcPr>
             <w:tcW w:w="2932" w:type="dxa"/>
@@ -17773,9 +17760,6 @@
         </w:tc>
       </w:tr>
       <w:tr>
-        <w:trPr>
-          <w:tblCellSpacing w:w="15" w:type="dxa"/>
-        </w:trPr>
         <w:tc>
           <w:tcPr>
             <w:tcW w:w="2932" w:type="dxa"/>
@@ -17856,9 +17840,6 @@
         </w:tc>
       </w:tr>
       <w:tr>
-        <w:trPr>
-          <w:tblCellSpacing w:w="15" w:type="dxa"/>
-        </w:trPr>
         <w:tc>
           <w:tcPr>
             <w:tcW w:w="2932" w:type="dxa"/>
@@ -17939,9 +17920,6 @@
         </w:tc>
       </w:tr>
       <w:tr>
-        <w:trPr>
-          <w:tblCellSpacing w:w="15" w:type="dxa"/>
-        </w:trPr>
         <w:tc>
           <w:tcPr>
             <w:tcW w:w="2932" w:type="dxa"/>
@@ -18069,16 +18047,15 @@
         <w:spacing w:before="0"/>
         <w:rPr>
           <w:rFonts w:eastAsia="Arial Unicode MS" w:cs="Times New Roman"/>
-          <w:b w:val="0"/>
-          <w:bCs/>
-          <w:color w:val="000000"/>
-          <w:szCs w:val="28"/>
-          <w:u w:color="000000"/>
-          <w:bdr w:val="nil"/>
-          <w:lang w:val="uk-UA" w:eastAsia="ru-RU"/>
-        </w:rPr>
-      </w:pPr>
-      <w:bookmarkStart w:id="15" w:name="_Toc224694569"/>
+          <w:bCs/>
+          <w:color w:val="000000"/>
+          <w:szCs w:val="28"/>
+          <w:u w:color="000000"/>
+          <w:bdr w:val="nil"/>
+          <w:lang w:val="uk-UA" w:eastAsia="ru-RU"/>
+        </w:rPr>
+      </w:pPr>
+      <w:bookmarkStart w:id="16" w:name="_Toc224694569"/>
       <w:r>
         <w:rPr>
           <w:rFonts w:eastAsia="Arial Unicode MS" w:cs="Times New Roman"/>
@@ -18115,190 +18092,2176 @@
           <w:lang w:val="uk-UA" w:eastAsia="ru-RU"/>
         </w:rPr>
         <w:t>ВИБІР ПРОГРАМНОГО ЗАБЕЗПЕЧЕННЯ ДЛЯ РОЗРОБКИ ПАРАЛЕЛЬНИХ ОБЧИСЛЕНЬ ТА ЙОГО КОРОТКИЙ ОПИС</w:t>
-      </w:r>
-      <w:bookmarkEnd w:id="15"/>
-    </w:p>
-    <w:p>
-      <w:pPr>
-        <w:ind w:firstLine="708"/>
-        <w:rPr>
-          <w:rFonts w:eastAsia="Arial Unicode MS" w:cs="Times New Roman"/>
-          <w:bCs/>
-          <w:color w:val="000000"/>
-          <w:szCs w:val="28"/>
-          <w:u w:color="000000"/>
-          <w:bdr w:val="nil"/>
-          <w:lang w:val="uk-UA" w:eastAsia="ru-RU"/>
-        </w:rPr>
-      </w:pPr>
-    </w:p>
-    <w:p>
-      <w:pPr>
-        <w:ind w:firstLine="708"/>
-        <w:rPr>
-          <w:rFonts w:eastAsia="Arial Unicode MS" w:cs="Times New Roman"/>
-          <w:bCs/>
-          <w:color w:val="000000"/>
-          <w:szCs w:val="28"/>
-          <w:u w:color="000000"/>
-          <w:bdr w:val="nil"/>
-          <w:lang w:val="uk-UA" w:eastAsia="ru-RU"/>
-        </w:rPr>
-      </w:pPr>
-      <w:r>
-        <w:rPr>
-          <w:rFonts w:eastAsia="Arial Unicode MS" w:cs="Times New Roman"/>
-          <w:bCs/>
-          <w:color w:val="000000"/>
-          <w:szCs w:val="28"/>
-          <w:u w:color="000000"/>
-          <w:bdr w:val="nil"/>
-          <w:lang w:val="uk-UA" w:eastAsia="ru-RU"/>
-        </w:rPr>
-        <w:br w:type="page"/>
-      </w:r>
-    </w:p>
-    <w:p>
-      <w:pPr>
-        <w:pStyle w:val="Heading1"/>
-        <w:spacing w:before="0"/>
-        <w:rPr>
-          <w:rFonts w:eastAsia="Arial Unicode MS" w:cs="Times New Roman"/>
-          <w:b w:val="0"/>
-          <w:bCs/>
-          <w:color w:val="000000"/>
-          <w:szCs w:val="28"/>
-          <w:u w:color="000000"/>
-          <w:bdr w:val="nil"/>
-          <w:lang w:val="uk-UA" w:eastAsia="ru-RU"/>
-        </w:rPr>
-      </w:pPr>
-      <w:bookmarkStart w:id="16" w:name="_Toc224694570"/>
-      <w:r>
-        <w:rPr>
-          <w:rFonts w:eastAsia="Arial Unicode MS" w:cs="Times New Roman"/>
-          <w:bCs/>
-          <w:color w:val="000000"/>
-          <w:szCs w:val="28"/>
-          <w:u w:color="000000"/>
-          <w:bdr w:val="nil"/>
-          <w:lang w:val="uk-UA" w:eastAsia="ru-RU"/>
-        </w:rPr>
-        <w:lastRenderedPageBreak/>
-        <w:t>4</w:t>
-      </w:r>
-      <w:r>
-        <w:rPr>
-          <w:rFonts w:eastAsia="Arial Unicode MS" w:cs="Times New Roman"/>
-          <w:bCs/>
-          <w:color w:val="000000"/>
-          <w:szCs w:val="28"/>
-          <w:u w:color="000000"/>
-          <w:bdr w:val="nil"/>
-          <w:lang w:val="uk-UA" w:eastAsia="ru-RU"/>
-        </w:rPr>
-        <w:t xml:space="preserve"> </w:t>
-      </w:r>
-      <w:r>
-        <w:rPr>
-          <w:rFonts w:eastAsia="Arial Unicode MS" w:cs="Times New Roman"/>
-          <w:bCs/>
-          <w:color w:val="000000"/>
-          <w:szCs w:val="28"/>
-          <w:u w:color="000000"/>
-          <w:bdr w:val="nil"/>
-          <w:lang w:val="uk-UA" w:eastAsia="ru-RU"/>
-        </w:rPr>
-        <w:t xml:space="preserve">РОЗРОБКА </w:t>
-      </w:r>
-      <w:r>
-        <w:rPr>
-          <w:rFonts w:eastAsia="Arial Unicode MS" w:cs="Times New Roman"/>
-          <w:bCs/>
-          <w:color w:val="000000"/>
-          <w:szCs w:val="28"/>
-          <w:u w:color="000000"/>
-          <w:bdr w:val="nil"/>
-          <w:lang w:val="uk-UA" w:eastAsia="ru-RU"/>
-        </w:rPr>
-        <w:t xml:space="preserve">ПАРАЛЕЛЬНОГО АЛГОРИТМУ </w:t>
-      </w:r>
-      <w:r>
-        <w:rPr>
-          <w:rFonts w:eastAsia="Arial Unicode MS" w:cs="Times New Roman"/>
-          <w:bCs/>
-          <w:color w:val="000000"/>
-          <w:szCs w:val="28"/>
-          <w:u w:color="000000"/>
-          <w:bdr w:val="nil"/>
-          <w:lang w:val="uk-UA" w:eastAsia="ru-RU"/>
-        </w:rPr>
-        <w:t>З ВИКОРИСТАННЯМ ОБРАНОГО ПРОГРАМНОГО ЗАБЕЗПЕЧЕННЯ: ПРО</w:t>
-      </w:r>
-      <w:r>
-        <w:rPr>
-          <w:rFonts w:eastAsia="Arial Unicode MS" w:cs="Times New Roman"/>
-          <w:b w:val="0"/>
-          <w:bCs/>
-          <w:color w:val="000000"/>
-          <w:szCs w:val="28"/>
-          <w:u w:color="000000"/>
-          <w:bdr w:val="nil"/>
-          <w:lang w:val="uk-UA" w:eastAsia="ru-RU"/>
-        </w:rPr>
-        <w:t>Є</w:t>
-      </w:r>
-      <w:r>
-        <w:rPr>
-          <w:rFonts w:eastAsia="Arial Unicode MS" w:cs="Times New Roman"/>
-          <w:bCs/>
-          <w:color w:val="000000"/>
-          <w:szCs w:val="28"/>
-          <w:u w:color="000000"/>
-          <w:bdr w:val="nil"/>
-          <w:lang w:val="uk-UA" w:eastAsia="ru-RU"/>
-        </w:rPr>
-        <w:t>КТУВАННЯ, РЕАЛІЗАЦІЯ, ТЕСТУВАННЯ</w:t>
       </w:r>
       <w:bookmarkEnd w:id="16"/>
     </w:p>
     <w:p>
       <w:pPr>
         <w:rPr>
-          <w:rFonts w:cs="Times New Roman"/>
           <w:lang w:val="uk-UA" w:eastAsia="ru-RU"/>
         </w:rPr>
       </w:pPr>
     </w:p>
     <w:p>
       <w:pPr>
-        <w:rPr>
-          <w:rFonts w:eastAsia="Arial Unicode MS" w:cs="Times New Roman"/>
-          <w:b/>
-          <w:bCs/>
-          <w:color w:val="000000"/>
-          <w:szCs w:val="28"/>
-          <w:u w:color="000000"/>
-          <w:bdr w:val="nil"/>
-          <w:lang w:val="uk-UA" w:eastAsia="ru-RU"/>
-        </w:rPr>
-      </w:pPr>
-      <w:r>
-        <w:rPr>
-          <w:rFonts w:eastAsia="Arial Unicode MS" w:cs="Times New Roman"/>
-          <w:b/>
-          <w:bCs/>
-          <w:color w:val="000000"/>
-          <w:szCs w:val="28"/>
-          <w:u w:color="000000"/>
-          <w:bdr w:val="nil"/>
-          <w:lang w:val="uk-UA" w:eastAsia="ru-RU"/>
-        </w:rPr>
-        <w:br w:type="page"/>
+        <w:pStyle w:val="Heading2"/>
+        <w:rPr>
+          <w:lang w:val="uk-UA"/>
+        </w:rPr>
+      </w:pPr>
+      <w:bookmarkStart w:id="17" w:name="_Hlk224777155"/>
+      <w:r>
+        <w:rPr>
+          <w:lang w:val="uk-UA"/>
+        </w:rPr>
+        <w:t>3</w:t>
+      </w:r>
+      <w:r>
+        <w:t>.</w:t>
+      </w:r>
+      <w:r>
+        <w:rPr>
+          <w:lang w:val="uk-UA"/>
+        </w:rPr>
+        <w:t>1</w:t>
+      </w:r>
+      <w:r>
+        <w:t xml:space="preserve"> </w:t>
+      </w:r>
+      <w:r>
+        <w:rPr>
+          <w:lang w:val="uk-UA"/>
+        </w:rPr>
+        <w:t>Характеристика обраної технології</w:t>
+      </w:r>
+    </w:p>
+    <w:bookmarkEnd w:id="17"/>
+    <w:p>
+      <w:pPr>
+        <w:ind w:firstLine="708"/>
+        <w:rPr>
+          <w:rFonts w:eastAsia="Arial Unicode MS" w:cs="Times New Roman"/>
+          <w:bCs/>
+          <w:color w:val="000000"/>
+          <w:szCs w:val="28"/>
+          <w:u w:color="000000"/>
+          <w:bdr w:val="nil"/>
+          <w:lang w:val="uk-UA" w:eastAsia="ru-RU"/>
+        </w:rPr>
+      </w:pPr>
+      <w:proofErr w:type="spellStart"/>
+      <w:r>
+        <w:rPr>
+          <w:rFonts w:eastAsia="Arial Unicode MS" w:cs="Times New Roman"/>
+          <w:bCs/>
+          <w:color w:val="000000"/>
+          <w:szCs w:val="28"/>
+          <w:u w:color="000000"/>
+          <w:bdr w:val="nil"/>
+          <w:lang w:val="uk-UA" w:eastAsia="ru-RU"/>
+        </w:rPr>
+        <w:t>Python</w:t>
+      </w:r>
+      <w:proofErr w:type="spellEnd"/>
+      <w:r>
+        <w:rPr>
+          <w:rFonts w:eastAsia="Arial Unicode MS" w:cs="Times New Roman"/>
+          <w:bCs/>
+          <w:color w:val="000000"/>
+          <w:szCs w:val="28"/>
+          <w:u w:color="000000"/>
+          <w:bdr w:val="nil"/>
+          <w:lang w:val="uk-UA" w:eastAsia="ru-RU"/>
+        </w:rPr>
+        <w:t xml:space="preserve"> є мовою високого рівня з розвиненою стандартною бібліотекою, у якій уже наявні засоби для побудови </w:t>
+      </w:r>
+      <w:proofErr w:type="spellStart"/>
+      <w:r>
+        <w:rPr>
+          <w:rFonts w:eastAsia="Arial Unicode MS" w:cs="Times New Roman"/>
+          <w:bCs/>
+          <w:color w:val="000000"/>
+          <w:szCs w:val="28"/>
+          <w:u w:color="000000"/>
+          <w:bdr w:val="nil"/>
+          <w:lang w:val="uk-UA" w:eastAsia="ru-RU"/>
+        </w:rPr>
+        <w:t>багатопотокових</w:t>
+      </w:r>
+      <w:proofErr w:type="spellEnd"/>
+      <w:r>
+        <w:rPr>
+          <w:rFonts w:eastAsia="Arial Unicode MS" w:cs="Times New Roman"/>
+          <w:bCs/>
+          <w:color w:val="000000"/>
+          <w:szCs w:val="28"/>
+          <w:u w:color="000000"/>
+          <w:bdr w:val="nil"/>
+          <w:lang w:val="uk-UA" w:eastAsia="ru-RU"/>
+        </w:rPr>
+        <w:t xml:space="preserve"> і </w:t>
+      </w:r>
+      <w:proofErr w:type="spellStart"/>
+      <w:r>
+        <w:rPr>
+          <w:rFonts w:eastAsia="Arial Unicode MS" w:cs="Times New Roman"/>
+          <w:bCs/>
+          <w:color w:val="000000"/>
+          <w:szCs w:val="28"/>
+          <w:u w:color="000000"/>
+          <w:bdr w:val="nil"/>
+          <w:lang w:val="uk-UA" w:eastAsia="ru-RU"/>
+        </w:rPr>
+        <w:t>багатопроцесних</w:t>
+      </w:r>
+      <w:proofErr w:type="spellEnd"/>
+      <w:r>
+        <w:rPr>
+          <w:rFonts w:eastAsia="Arial Unicode MS" w:cs="Times New Roman"/>
+          <w:bCs/>
+          <w:color w:val="000000"/>
+          <w:szCs w:val="28"/>
+          <w:u w:color="000000"/>
+          <w:bdr w:val="nil"/>
+          <w:lang w:val="uk-UA" w:eastAsia="ru-RU"/>
+        </w:rPr>
+        <w:t xml:space="preserve"> програм. Для цієї курсової роботи це важливо з двох причин. По-перше, реалізація алгоритму </w:t>
+      </w:r>
+      <w:proofErr w:type="spellStart"/>
+      <w:r>
+        <w:rPr>
+          <w:rFonts w:eastAsia="Arial Unicode MS" w:cs="Times New Roman"/>
+          <w:bCs/>
+          <w:color w:val="000000"/>
+          <w:szCs w:val="28"/>
+          <w:u w:color="000000"/>
+          <w:bdr w:val="nil"/>
+          <w:lang w:val="uk-UA" w:eastAsia="ru-RU"/>
+        </w:rPr>
+        <w:t>бітонічного</w:t>
+      </w:r>
+      <w:proofErr w:type="spellEnd"/>
+      <w:r>
+        <w:rPr>
+          <w:rFonts w:eastAsia="Arial Unicode MS" w:cs="Times New Roman"/>
+          <w:bCs/>
+          <w:color w:val="000000"/>
+          <w:szCs w:val="28"/>
+          <w:u w:color="000000"/>
+          <w:bdr w:val="nil"/>
+          <w:lang w:val="uk-UA" w:eastAsia="ru-RU"/>
+        </w:rPr>
+        <w:t xml:space="preserve"> сортування потребує багаторазового відтворення однакових </w:t>
+      </w:r>
+      <w:proofErr w:type="spellStart"/>
+      <w:r>
+        <w:rPr>
+          <w:rFonts w:eastAsia="Arial Unicode MS" w:cs="Times New Roman"/>
+          <w:bCs/>
+          <w:color w:val="000000"/>
+          <w:szCs w:val="28"/>
+          <w:u w:color="000000"/>
+          <w:bdr w:val="nil"/>
+          <w:lang w:val="uk-UA" w:eastAsia="ru-RU"/>
+        </w:rPr>
+        <w:t>compare-swap</w:t>
+      </w:r>
+      <w:proofErr w:type="spellEnd"/>
+      <w:r>
+        <w:rPr>
+          <w:rFonts w:eastAsia="Arial Unicode MS" w:cs="Times New Roman"/>
+          <w:bCs/>
+          <w:color w:val="000000"/>
+          <w:szCs w:val="28"/>
+          <w:u w:color="000000"/>
+          <w:bdr w:val="nil"/>
+          <w:lang w:val="uk-UA" w:eastAsia="ru-RU"/>
+        </w:rPr>
+        <w:t xml:space="preserve"> операцій, тому код повинен бути компактним і достатньо прозорим для аналізу. По-друге, експериментальна частина роботи вимагає не лише реалізації алгоритму, а й тестування, вимірювання часу виконання та варіювання параметрів паралельного запуску.</w:t>
       </w:r>
     </w:p>
     <w:p>
       <w:pPr>
+        <w:ind w:firstLine="708"/>
+        <w:rPr>
+          <w:rFonts w:eastAsia="Arial Unicode MS" w:cs="Times New Roman"/>
+          <w:bCs/>
+          <w:color w:val="000000"/>
+          <w:szCs w:val="28"/>
+          <w:u w:color="000000"/>
+          <w:bdr w:val="nil"/>
+          <w:lang w:val="uk-UA" w:eastAsia="ru-RU"/>
+        </w:rPr>
+      </w:pPr>
+      <w:r>
+        <w:rPr>
+          <w:rFonts w:eastAsia="Arial Unicode MS" w:cs="Times New Roman"/>
+          <w:bCs/>
+          <w:color w:val="000000"/>
+          <w:szCs w:val="28"/>
+          <w:u w:color="000000"/>
+          <w:bdr w:val="nil"/>
+          <w:lang w:val="uk-UA" w:eastAsia="ru-RU"/>
+        </w:rPr>
+        <w:t xml:space="preserve">Попри те, що </w:t>
+      </w:r>
+      <w:proofErr w:type="spellStart"/>
+      <w:r>
+        <w:rPr>
+          <w:rFonts w:eastAsia="Arial Unicode MS" w:cs="Times New Roman"/>
+          <w:bCs/>
+          <w:color w:val="000000"/>
+          <w:szCs w:val="28"/>
+          <w:u w:color="000000"/>
+          <w:bdr w:val="nil"/>
+          <w:lang w:val="uk-UA" w:eastAsia="ru-RU"/>
+        </w:rPr>
+        <w:t>Python</w:t>
+      </w:r>
+      <w:proofErr w:type="spellEnd"/>
+      <w:r>
+        <w:rPr>
+          <w:rFonts w:eastAsia="Arial Unicode MS" w:cs="Times New Roman"/>
+          <w:bCs/>
+          <w:color w:val="000000"/>
+          <w:szCs w:val="28"/>
+          <w:u w:color="000000"/>
+          <w:bdr w:val="nil"/>
+          <w:lang w:val="uk-UA" w:eastAsia="ru-RU"/>
+        </w:rPr>
+        <w:t xml:space="preserve"> поступається мовам нижчого рівня за максимальною швидкодією, він добре підходить для </w:t>
+      </w:r>
+      <w:proofErr w:type="spellStart"/>
+      <w:r>
+        <w:rPr>
+          <w:rFonts w:eastAsia="Arial Unicode MS" w:cs="Times New Roman"/>
+          <w:bCs/>
+          <w:color w:val="000000"/>
+          <w:szCs w:val="28"/>
+          <w:u w:color="000000"/>
+          <w:bdr w:val="nil"/>
+          <w:lang w:val="uk-UA" w:eastAsia="ru-RU"/>
+        </w:rPr>
+        <w:t>прототипування</w:t>
+      </w:r>
+      <w:proofErr w:type="spellEnd"/>
+      <w:r>
+        <w:rPr>
+          <w:rFonts w:eastAsia="Arial Unicode MS" w:cs="Times New Roman"/>
+          <w:bCs/>
+          <w:color w:val="000000"/>
+          <w:szCs w:val="28"/>
+          <w:u w:color="000000"/>
+          <w:bdr w:val="nil"/>
+          <w:lang w:val="uk-UA" w:eastAsia="ru-RU"/>
+        </w:rPr>
+        <w:t xml:space="preserve"> та дослідження паралельних алгоритмів. У межах цієї роботи це дозволяє зосередитися на правильному поділі задачі, синхронізації процесів і спільному доступі до даних, не ускладнюючи реалізацію </w:t>
+      </w:r>
+      <w:proofErr w:type="spellStart"/>
+      <w:r>
+        <w:rPr>
+          <w:rFonts w:eastAsia="Arial Unicode MS" w:cs="Times New Roman"/>
+          <w:bCs/>
+          <w:color w:val="000000"/>
+          <w:szCs w:val="28"/>
+          <w:u w:color="000000"/>
+          <w:bdr w:val="nil"/>
+          <w:lang w:val="uk-UA" w:eastAsia="ru-RU"/>
+        </w:rPr>
+        <w:t>низькорівневими</w:t>
+      </w:r>
+      <w:proofErr w:type="spellEnd"/>
+      <w:r>
+        <w:rPr>
+          <w:rFonts w:eastAsia="Arial Unicode MS" w:cs="Times New Roman"/>
+          <w:bCs/>
+          <w:color w:val="000000"/>
+          <w:szCs w:val="28"/>
+          <w:u w:color="000000"/>
+          <w:bdr w:val="nil"/>
+          <w:lang w:val="uk-UA" w:eastAsia="ru-RU"/>
+        </w:rPr>
+        <w:t xml:space="preserve"> деталями керування пам’яттю.</w:t>
+      </w:r>
+    </w:p>
+    <w:p>
+      <w:pPr>
+        <w:pStyle w:val="Heading2"/>
+        <w:rPr>
+          <w:lang w:val="uk-UA"/>
+        </w:rPr>
+      </w:pPr>
+      <w:bookmarkStart w:id="18" w:name="_Hlk224777873"/>
+      <w:r>
+        <w:rPr>
+          <w:lang w:val="uk-UA"/>
+        </w:rPr>
+        <w:t>3</w:t>
+      </w:r>
+      <w:r>
+        <w:t>.</w:t>
+      </w:r>
+      <w:r>
+        <w:rPr>
+          <w:lang w:val="uk-UA"/>
+        </w:rPr>
+        <w:t>2</w:t>
+      </w:r>
+      <w:r>
+        <w:t xml:space="preserve"> </w:t>
+      </w:r>
+      <w:r>
+        <w:rPr>
+          <w:lang w:val="uk-UA"/>
+        </w:rPr>
+        <w:t>Засоби для організації паралельних обчислень</w:t>
+      </w:r>
+    </w:p>
+    <w:bookmarkEnd w:id="18"/>
+    <w:p>
+      <w:pPr>
+        <w:ind w:firstLine="708"/>
+        <w:rPr>
+          <w:rFonts w:eastAsia="Arial Unicode MS" w:cs="Times New Roman"/>
+          <w:bCs/>
+          <w:color w:val="000000"/>
+          <w:szCs w:val="28"/>
+          <w:u w:color="000000"/>
+          <w:bdr w:val="nil"/>
+          <w:lang w:val="uk-UA" w:eastAsia="ru-RU"/>
+        </w:rPr>
+      </w:pPr>
+      <w:r>
+        <w:rPr>
+          <w:rFonts w:eastAsia="Arial Unicode MS" w:cs="Times New Roman"/>
+          <w:bCs/>
+          <w:color w:val="000000"/>
+          <w:szCs w:val="28"/>
+          <w:u w:color="000000"/>
+          <w:bdr w:val="nil"/>
+          <w:lang w:val="uk-UA" w:eastAsia="ru-RU"/>
+        </w:rPr>
+        <w:t xml:space="preserve">Основним засобом паралельної реалізації в роботі обрано модуль </w:t>
+      </w:r>
+      <w:proofErr w:type="spellStart"/>
+      <w:r>
+        <w:rPr>
+          <w:rFonts w:eastAsia="Arial Unicode MS" w:cs="Times New Roman"/>
+          <w:bCs/>
+          <w:color w:val="000000"/>
+          <w:szCs w:val="28"/>
+          <w:u w:color="000000"/>
+          <w:bdr w:val="nil"/>
+          <w:lang w:val="uk-UA" w:eastAsia="ru-RU"/>
+        </w:rPr>
+        <w:t>multiprocessing</w:t>
+      </w:r>
+      <w:proofErr w:type="spellEnd"/>
+      <w:r>
+        <w:rPr>
+          <w:rFonts w:eastAsia="Arial Unicode MS" w:cs="Times New Roman"/>
+          <w:bCs/>
+          <w:color w:val="000000"/>
+          <w:szCs w:val="28"/>
+          <w:u w:color="000000"/>
+          <w:bdr w:val="nil"/>
+          <w:lang w:val="uk-UA" w:eastAsia="ru-RU"/>
+        </w:rPr>
+        <w:t xml:space="preserve">. Його головна перевага полягає в тому, що він використовує окремі процеси, а не потоки, і тому дає змогу обійти обмеження </w:t>
+      </w:r>
+      <w:proofErr w:type="spellStart"/>
+      <w:r>
+        <w:rPr>
+          <w:rFonts w:eastAsia="Arial Unicode MS" w:cs="Times New Roman"/>
+          <w:bCs/>
+          <w:color w:val="000000"/>
+          <w:szCs w:val="28"/>
+          <w:u w:color="000000"/>
+          <w:bdr w:val="nil"/>
+          <w:lang w:val="uk-UA" w:eastAsia="ru-RU"/>
+        </w:rPr>
+        <w:t>Global</w:t>
+      </w:r>
+      <w:proofErr w:type="spellEnd"/>
+      <w:r>
+        <w:rPr>
+          <w:rFonts w:eastAsia="Arial Unicode MS" w:cs="Times New Roman"/>
+          <w:bCs/>
+          <w:color w:val="000000"/>
+          <w:szCs w:val="28"/>
+          <w:u w:color="000000"/>
+          <w:bdr w:val="nil"/>
+          <w:lang w:val="uk-UA" w:eastAsia="ru-RU"/>
+        </w:rPr>
+        <w:t xml:space="preserve"> </w:t>
+      </w:r>
+      <w:proofErr w:type="spellStart"/>
+      <w:r>
+        <w:rPr>
+          <w:rFonts w:eastAsia="Arial Unicode MS" w:cs="Times New Roman"/>
+          <w:bCs/>
+          <w:color w:val="000000"/>
+          <w:szCs w:val="28"/>
+          <w:u w:color="000000"/>
+          <w:bdr w:val="nil"/>
+          <w:lang w:val="uk-UA" w:eastAsia="ru-RU"/>
+        </w:rPr>
+        <w:t>Interpreter</w:t>
+      </w:r>
+      <w:proofErr w:type="spellEnd"/>
+      <w:r>
+        <w:rPr>
+          <w:rFonts w:eastAsia="Arial Unicode MS" w:cs="Times New Roman"/>
+          <w:bCs/>
+          <w:color w:val="000000"/>
+          <w:szCs w:val="28"/>
+          <w:u w:color="000000"/>
+          <w:bdr w:val="nil"/>
+          <w:lang w:val="uk-UA" w:eastAsia="ru-RU"/>
+        </w:rPr>
+        <w:t xml:space="preserve"> </w:t>
+      </w:r>
+      <w:proofErr w:type="spellStart"/>
+      <w:r>
+        <w:rPr>
+          <w:rFonts w:eastAsia="Arial Unicode MS" w:cs="Times New Roman"/>
+          <w:bCs/>
+          <w:color w:val="000000"/>
+          <w:szCs w:val="28"/>
+          <w:u w:color="000000"/>
+          <w:bdr w:val="nil"/>
+          <w:lang w:val="uk-UA" w:eastAsia="ru-RU"/>
+        </w:rPr>
+        <w:t>Lock</w:t>
+      </w:r>
+      <w:proofErr w:type="spellEnd"/>
+      <w:r>
+        <w:rPr>
+          <w:rFonts w:eastAsia="Arial Unicode MS" w:cs="Times New Roman"/>
+          <w:bCs/>
+          <w:color w:val="000000"/>
+          <w:szCs w:val="28"/>
+          <w:u w:color="000000"/>
+          <w:bdr w:val="nil"/>
+          <w:lang w:val="uk-UA" w:eastAsia="ru-RU"/>
+        </w:rPr>
+        <w:t xml:space="preserve"> у </w:t>
+      </w:r>
+      <w:proofErr w:type="spellStart"/>
+      <w:r>
+        <w:rPr>
+          <w:rFonts w:eastAsia="Arial Unicode MS" w:cs="Times New Roman"/>
+          <w:bCs/>
+          <w:color w:val="000000"/>
+          <w:szCs w:val="28"/>
+          <w:u w:color="000000"/>
+          <w:bdr w:val="nil"/>
+          <w:lang w:val="uk-UA" w:eastAsia="ru-RU"/>
+        </w:rPr>
+        <w:t>CPython</w:t>
+      </w:r>
+      <w:proofErr w:type="spellEnd"/>
+      <w:r>
+        <w:rPr>
+          <w:rFonts w:eastAsia="Arial Unicode MS" w:cs="Times New Roman"/>
+          <w:bCs/>
+          <w:color w:val="000000"/>
+          <w:szCs w:val="28"/>
+          <w:u w:color="000000"/>
+          <w:bdr w:val="nil"/>
+          <w:lang w:val="uk-UA" w:eastAsia="ru-RU"/>
+        </w:rPr>
+        <w:t xml:space="preserve">. Для задачі </w:t>
+      </w:r>
+      <w:proofErr w:type="spellStart"/>
+      <w:r>
+        <w:rPr>
+          <w:rFonts w:eastAsia="Arial Unicode MS" w:cs="Times New Roman"/>
+          <w:bCs/>
+          <w:color w:val="000000"/>
+          <w:szCs w:val="28"/>
+          <w:u w:color="000000"/>
+          <w:bdr w:val="nil"/>
+          <w:lang w:val="uk-UA" w:eastAsia="ru-RU"/>
+        </w:rPr>
+        <w:t>бітонічного</w:t>
+      </w:r>
+      <w:proofErr w:type="spellEnd"/>
+      <w:r>
+        <w:rPr>
+          <w:rFonts w:eastAsia="Arial Unicode MS" w:cs="Times New Roman"/>
+          <w:bCs/>
+          <w:color w:val="000000"/>
+          <w:szCs w:val="28"/>
+          <w:u w:color="000000"/>
+          <w:bdr w:val="nil"/>
+          <w:lang w:val="uk-UA" w:eastAsia="ru-RU"/>
+        </w:rPr>
+        <w:t xml:space="preserve"> сортування це принципово, оскільки сортування є CPU-</w:t>
+      </w:r>
+      <w:proofErr w:type="spellStart"/>
+      <w:r>
+        <w:rPr>
+          <w:rFonts w:eastAsia="Arial Unicode MS" w:cs="Times New Roman"/>
+          <w:bCs/>
+          <w:color w:val="000000"/>
+          <w:szCs w:val="28"/>
+          <w:u w:color="000000"/>
+          <w:bdr w:val="nil"/>
+          <w:lang w:val="uk-UA" w:eastAsia="ru-RU"/>
+        </w:rPr>
+        <w:t>bound</w:t>
+      </w:r>
+      <w:proofErr w:type="spellEnd"/>
+      <w:r>
+        <w:rPr>
+          <w:rFonts w:eastAsia="Arial Unicode MS" w:cs="Times New Roman"/>
+          <w:bCs/>
+          <w:color w:val="000000"/>
+          <w:szCs w:val="28"/>
+          <w:u w:color="000000"/>
+          <w:bdr w:val="nil"/>
+          <w:lang w:val="uk-UA" w:eastAsia="ru-RU"/>
+        </w:rPr>
+        <w:t xml:space="preserve"> алгоритмом, де виграш очікується саме від одночасного виконання обчислень на кількох ядрах процесора.</w:t>
+      </w:r>
+    </w:p>
+    <w:p>
+      <w:pPr>
+        <w:ind w:firstLine="708"/>
+        <w:rPr>
+          <w:rFonts w:eastAsia="Arial Unicode MS" w:cs="Times New Roman"/>
+          <w:bCs/>
+          <w:color w:val="000000"/>
+          <w:szCs w:val="28"/>
+          <w:u w:color="000000"/>
+          <w:bdr w:val="nil"/>
+          <w:lang w:val="uk-UA" w:eastAsia="ru-RU"/>
+        </w:rPr>
+      </w:pPr>
+      <w:r>
+        <w:rPr>
+          <w:rFonts w:eastAsia="Arial Unicode MS" w:cs="Times New Roman"/>
+          <w:bCs/>
+          <w:color w:val="000000"/>
+          <w:szCs w:val="28"/>
+          <w:u w:color="000000"/>
+          <w:bdr w:val="nil"/>
+          <w:lang w:val="uk-UA" w:eastAsia="ru-RU"/>
+        </w:rPr>
+        <w:t xml:space="preserve">Важливим доповненням до </w:t>
+      </w:r>
+      <w:proofErr w:type="spellStart"/>
+      <w:r>
+        <w:rPr>
+          <w:rFonts w:eastAsia="Arial Unicode MS" w:cs="Times New Roman"/>
+          <w:bCs/>
+          <w:color w:val="000000"/>
+          <w:szCs w:val="28"/>
+          <w:u w:color="000000"/>
+          <w:bdr w:val="nil"/>
+          <w:lang w:val="uk-UA" w:eastAsia="ru-RU"/>
+        </w:rPr>
+        <w:t>multiprocessing</w:t>
+      </w:r>
+      <w:proofErr w:type="spellEnd"/>
+      <w:r>
+        <w:rPr>
+          <w:rFonts w:eastAsia="Arial Unicode MS" w:cs="Times New Roman"/>
+          <w:bCs/>
+          <w:color w:val="000000"/>
+          <w:szCs w:val="28"/>
+          <w:u w:color="000000"/>
+          <w:bdr w:val="nil"/>
+          <w:lang w:val="uk-UA" w:eastAsia="ru-RU"/>
+        </w:rPr>
+        <w:t xml:space="preserve"> є модуль </w:t>
+      </w:r>
+      <w:proofErr w:type="spellStart"/>
+      <w:r>
+        <w:rPr>
+          <w:rFonts w:eastAsia="Arial Unicode MS" w:cs="Times New Roman"/>
+          <w:bCs/>
+          <w:color w:val="000000"/>
+          <w:szCs w:val="28"/>
+          <w:u w:color="000000"/>
+          <w:bdr w:val="nil"/>
+          <w:lang w:val="uk-UA" w:eastAsia="ru-RU"/>
+        </w:rPr>
+        <w:t>multiprocessing.shared_memory</w:t>
+      </w:r>
+      <w:proofErr w:type="spellEnd"/>
+      <w:r>
+        <w:rPr>
+          <w:rFonts w:eastAsia="Arial Unicode MS" w:cs="Times New Roman"/>
+          <w:bCs/>
+          <w:color w:val="000000"/>
+          <w:szCs w:val="28"/>
+          <w:u w:color="000000"/>
+          <w:bdr w:val="nil"/>
+          <w:lang w:val="uk-UA" w:eastAsia="ru-RU"/>
+        </w:rPr>
+        <w:t xml:space="preserve">, який надає засоби спільного доступу до даних між процесами. Для паралельних обчислень це корисно тоді, коли потрібно працювати з великими масивами даних і водночас зменшити накладні витрати на їх передавання між процесами. Саме тому цей модуль доцільно розглядати як природне доповнення до процесної моделі паралелізації в </w:t>
+      </w:r>
+      <w:proofErr w:type="spellStart"/>
+      <w:r>
+        <w:rPr>
+          <w:rFonts w:eastAsia="Arial Unicode MS" w:cs="Times New Roman"/>
+          <w:bCs/>
+          <w:color w:val="000000"/>
+          <w:szCs w:val="28"/>
+          <w:u w:color="000000"/>
+          <w:bdr w:val="nil"/>
+          <w:lang w:val="uk-UA" w:eastAsia="ru-RU"/>
+        </w:rPr>
+        <w:t>Python</w:t>
+      </w:r>
+      <w:proofErr w:type="spellEnd"/>
+      <w:r>
+        <w:rPr>
+          <w:rFonts w:eastAsia="Arial Unicode MS" w:cs="Times New Roman"/>
+          <w:bCs/>
+          <w:color w:val="000000"/>
+          <w:szCs w:val="28"/>
+          <w:u w:color="000000"/>
+          <w:bdr w:val="nil"/>
+          <w:lang w:val="uk-UA" w:eastAsia="ru-RU"/>
+        </w:rPr>
+        <w:t>.</w:t>
+      </w:r>
+    </w:p>
+    <w:p>
+      <w:pPr>
+        <w:ind w:firstLine="708"/>
+        <w:rPr>
+          <w:rFonts w:eastAsia="Arial Unicode MS" w:cs="Times New Roman"/>
+          <w:bCs/>
+          <w:color w:val="000000"/>
+          <w:szCs w:val="28"/>
+          <w:u w:color="000000"/>
+          <w:bdr w:val="nil"/>
+          <w:lang w:val="uk-UA" w:eastAsia="ru-RU"/>
+        </w:rPr>
+      </w:pPr>
+      <w:r>
+        <w:rPr>
+          <w:rFonts w:eastAsia="Arial Unicode MS" w:cs="Times New Roman"/>
+          <w:bCs/>
+          <w:color w:val="000000"/>
+          <w:szCs w:val="28"/>
+          <w:u w:color="000000"/>
+          <w:bdr w:val="nil"/>
+          <w:lang w:val="uk-UA" w:eastAsia="ru-RU"/>
+        </w:rPr>
+        <w:lastRenderedPageBreak/>
+        <w:t xml:space="preserve">Поряд з </w:t>
+      </w:r>
+      <w:proofErr w:type="spellStart"/>
+      <w:r>
+        <w:rPr>
+          <w:rFonts w:eastAsia="Arial Unicode MS" w:cs="Times New Roman"/>
+          <w:bCs/>
+          <w:color w:val="000000"/>
+          <w:szCs w:val="28"/>
+          <w:u w:color="000000"/>
+          <w:bdr w:val="nil"/>
+          <w:lang w:val="uk-UA" w:eastAsia="ru-RU"/>
+        </w:rPr>
+        <w:t>multiprocessing</w:t>
+      </w:r>
+      <w:proofErr w:type="spellEnd"/>
+      <w:r>
+        <w:rPr>
+          <w:rFonts w:eastAsia="Arial Unicode MS" w:cs="Times New Roman"/>
+          <w:bCs/>
+          <w:color w:val="000000"/>
+          <w:szCs w:val="28"/>
+          <w:u w:color="000000"/>
+          <w:bdr w:val="nil"/>
+          <w:lang w:val="uk-UA" w:eastAsia="ru-RU"/>
+        </w:rPr>
+        <w:t xml:space="preserve"> у </w:t>
+      </w:r>
+      <w:proofErr w:type="spellStart"/>
+      <w:r>
+        <w:rPr>
+          <w:rFonts w:eastAsia="Arial Unicode MS" w:cs="Times New Roman"/>
+          <w:bCs/>
+          <w:color w:val="000000"/>
+          <w:szCs w:val="28"/>
+          <w:u w:color="000000"/>
+          <w:bdr w:val="nil"/>
+          <w:lang w:val="uk-UA" w:eastAsia="ru-RU"/>
+        </w:rPr>
+        <w:t>Python</w:t>
+      </w:r>
+      <w:proofErr w:type="spellEnd"/>
+      <w:r>
+        <w:rPr>
+          <w:rFonts w:eastAsia="Arial Unicode MS" w:cs="Times New Roman"/>
+          <w:bCs/>
+          <w:color w:val="000000"/>
+          <w:szCs w:val="28"/>
+          <w:u w:color="000000"/>
+          <w:bdr w:val="nil"/>
+          <w:lang w:val="uk-UA" w:eastAsia="ru-RU"/>
+        </w:rPr>
+        <w:t xml:space="preserve"> існує модуль </w:t>
+      </w:r>
+      <w:proofErr w:type="spellStart"/>
+      <w:r>
+        <w:rPr>
+          <w:rFonts w:eastAsia="Arial Unicode MS" w:cs="Times New Roman"/>
+          <w:bCs/>
+          <w:color w:val="000000"/>
+          <w:szCs w:val="28"/>
+          <w:u w:color="000000"/>
+          <w:bdr w:val="nil"/>
+          <w:lang w:val="uk-UA" w:eastAsia="ru-RU"/>
+        </w:rPr>
+        <w:t>threading</w:t>
+      </w:r>
+      <w:proofErr w:type="spellEnd"/>
+      <w:r>
+        <w:rPr>
+          <w:rFonts w:eastAsia="Arial Unicode MS" w:cs="Times New Roman"/>
+          <w:bCs/>
+          <w:color w:val="000000"/>
+          <w:szCs w:val="28"/>
+          <w:u w:color="000000"/>
+          <w:bdr w:val="nil"/>
+          <w:lang w:val="uk-UA" w:eastAsia="ru-RU"/>
+        </w:rPr>
+        <w:t>, який забезпечує запуск кількох потоків у межах одного процесу. Його перевагою є спільний адресний простір і простіша модель обміну даними. Проте для CPU-</w:t>
+      </w:r>
+      <w:proofErr w:type="spellStart"/>
+      <w:r>
+        <w:rPr>
+          <w:rFonts w:eastAsia="Arial Unicode MS" w:cs="Times New Roman"/>
+          <w:bCs/>
+          <w:color w:val="000000"/>
+          <w:szCs w:val="28"/>
+          <w:u w:color="000000"/>
+          <w:bdr w:val="nil"/>
+          <w:lang w:val="uk-UA" w:eastAsia="ru-RU"/>
+        </w:rPr>
+        <w:t>bound</w:t>
+      </w:r>
+      <w:proofErr w:type="spellEnd"/>
+      <w:r>
+        <w:rPr>
+          <w:rFonts w:eastAsia="Arial Unicode MS" w:cs="Times New Roman"/>
+          <w:bCs/>
+          <w:color w:val="000000"/>
+          <w:szCs w:val="28"/>
+          <w:u w:color="000000"/>
+          <w:bdr w:val="nil"/>
+          <w:lang w:val="uk-UA" w:eastAsia="ru-RU"/>
+        </w:rPr>
+        <w:t xml:space="preserve"> задач у стандартній реалізації </w:t>
+      </w:r>
+      <w:proofErr w:type="spellStart"/>
+      <w:r>
+        <w:rPr>
+          <w:rFonts w:eastAsia="Arial Unicode MS" w:cs="Times New Roman"/>
+          <w:bCs/>
+          <w:color w:val="000000"/>
+          <w:szCs w:val="28"/>
+          <w:u w:color="000000"/>
+          <w:bdr w:val="nil"/>
+          <w:lang w:val="uk-UA" w:eastAsia="ru-RU"/>
+        </w:rPr>
+        <w:t>CPython</w:t>
+      </w:r>
+      <w:proofErr w:type="spellEnd"/>
+      <w:r>
+        <w:rPr>
+          <w:rFonts w:eastAsia="Arial Unicode MS" w:cs="Times New Roman"/>
+          <w:bCs/>
+          <w:color w:val="000000"/>
+          <w:szCs w:val="28"/>
+          <w:u w:color="000000"/>
+          <w:bdr w:val="nil"/>
+          <w:lang w:val="uk-UA" w:eastAsia="ru-RU"/>
+        </w:rPr>
+        <w:t xml:space="preserve"> використання потоків має суттєве обмеження через GIL: одночасне виконання </w:t>
+      </w:r>
+      <w:proofErr w:type="spellStart"/>
+      <w:r>
+        <w:rPr>
+          <w:rFonts w:eastAsia="Arial Unicode MS" w:cs="Times New Roman"/>
+          <w:bCs/>
+          <w:color w:val="000000"/>
+          <w:szCs w:val="28"/>
+          <w:u w:color="000000"/>
+          <w:bdr w:val="nil"/>
+          <w:lang w:val="uk-UA" w:eastAsia="ru-RU"/>
+        </w:rPr>
+        <w:t>байткоду</w:t>
+      </w:r>
+      <w:proofErr w:type="spellEnd"/>
+      <w:r>
+        <w:rPr>
+          <w:rFonts w:eastAsia="Arial Unicode MS" w:cs="Times New Roman"/>
+          <w:bCs/>
+          <w:color w:val="000000"/>
+          <w:szCs w:val="28"/>
+          <w:u w:color="000000"/>
+          <w:bdr w:val="nil"/>
+          <w:lang w:val="uk-UA" w:eastAsia="ru-RU"/>
+        </w:rPr>
+        <w:t xml:space="preserve"> на кількох ядрах фактично не досягається. Тому </w:t>
+      </w:r>
+      <w:proofErr w:type="spellStart"/>
+      <w:r>
+        <w:rPr>
+          <w:rFonts w:eastAsia="Arial Unicode MS" w:cs="Times New Roman"/>
+          <w:bCs/>
+          <w:color w:val="000000"/>
+          <w:szCs w:val="28"/>
+          <w:u w:color="000000"/>
+          <w:bdr w:val="nil"/>
+          <w:lang w:val="uk-UA" w:eastAsia="ru-RU"/>
+        </w:rPr>
+        <w:t>threading</w:t>
+      </w:r>
+      <w:proofErr w:type="spellEnd"/>
+      <w:r>
+        <w:rPr>
+          <w:rFonts w:eastAsia="Arial Unicode MS" w:cs="Times New Roman"/>
+          <w:bCs/>
+          <w:color w:val="000000"/>
+          <w:szCs w:val="28"/>
+          <w:u w:color="000000"/>
+          <w:bdr w:val="nil"/>
+          <w:lang w:val="uk-UA" w:eastAsia="ru-RU"/>
+        </w:rPr>
+        <w:t xml:space="preserve"> доцільніше застосовувати для I/O-</w:t>
+      </w:r>
+      <w:proofErr w:type="spellStart"/>
+      <w:r>
+        <w:rPr>
+          <w:rFonts w:eastAsia="Arial Unicode MS" w:cs="Times New Roman"/>
+          <w:bCs/>
+          <w:color w:val="000000"/>
+          <w:szCs w:val="28"/>
+          <w:u w:color="000000"/>
+          <w:bdr w:val="nil"/>
+          <w:lang w:val="uk-UA" w:eastAsia="ru-RU"/>
+        </w:rPr>
+        <w:t>bound</w:t>
+      </w:r>
+      <w:proofErr w:type="spellEnd"/>
+      <w:r>
+        <w:rPr>
+          <w:rFonts w:eastAsia="Arial Unicode MS" w:cs="Times New Roman"/>
+          <w:bCs/>
+          <w:color w:val="000000"/>
+          <w:szCs w:val="28"/>
+          <w:u w:color="000000"/>
+          <w:bdr w:val="nil"/>
+          <w:lang w:val="uk-UA" w:eastAsia="ru-RU"/>
+        </w:rPr>
+        <w:t xml:space="preserve"> задач, а не для інтенсивного сортування великих масивів.</w:t>
+      </w:r>
+    </w:p>
+    <w:p>
+      <w:pPr>
+        <w:ind w:firstLine="708"/>
+        <w:rPr>
+          <w:rFonts w:eastAsia="Arial Unicode MS" w:cs="Times New Roman"/>
+          <w:bCs/>
+          <w:color w:val="000000"/>
+          <w:szCs w:val="28"/>
+          <w:u w:color="000000"/>
+          <w:bdr w:val="nil"/>
+          <w:lang w:val="uk-UA" w:eastAsia="ru-RU"/>
+        </w:rPr>
+      </w:pPr>
+      <w:r>
+        <w:rPr>
+          <w:rFonts w:eastAsia="Arial Unicode MS" w:cs="Times New Roman"/>
+          <w:bCs/>
+          <w:color w:val="000000"/>
+          <w:szCs w:val="28"/>
+          <w:u w:color="000000"/>
+          <w:bdr w:val="nil"/>
+          <w:lang w:val="uk-UA" w:eastAsia="ru-RU"/>
+        </w:rPr>
+        <w:t xml:space="preserve">Як додаткову альтернативу варто розглянути модуль </w:t>
+      </w:r>
+      <w:proofErr w:type="spellStart"/>
+      <w:r>
+        <w:rPr>
+          <w:rFonts w:eastAsia="Arial Unicode MS" w:cs="Times New Roman"/>
+          <w:bCs/>
+          <w:color w:val="000000"/>
+          <w:szCs w:val="28"/>
+          <w:u w:color="000000"/>
+          <w:bdr w:val="nil"/>
+          <w:lang w:val="uk-UA" w:eastAsia="ru-RU"/>
+        </w:rPr>
+        <w:t>concurrent.futures</w:t>
+      </w:r>
+      <w:proofErr w:type="spellEnd"/>
+      <w:r>
+        <w:rPr>
+          <w:rFonts w:eastAsia="Arial Unicode MS" w:cs="Times New Roman"/>
+          <w:bCs/>
+          <w:color w:val="000000"/>
+          <w:szCs w:val="28"/>
+          <w:u w:color="000000"/>
+          <w:bdr w:val="nil"/>
+          <w:lang w:val="uk-UA" w:eastAsia="ru-RU"/>
+        </w:rPr>
+        <w:t xml:space="preserve">. Він надає </w:t>
+      </w:r>
+      <w:proofErr w:type="spellStart"/>
+      <w:r>
+        <w:rPr>
+          <w:rFonts w:eastAsia="Arial Unicode MS" w:cs="Times New Roman"/>
+          <w:bCs/>
+          <w:color w:val="000000"/>
+          <w:szCs w:val="28"/>
+          <w:u w:color="000000"/>
+          <w:bdr w:val="nil"/>
+          <w:lang w:val="uk-UA" w:eastAsia="ru-RU"/>
+        </w:rPr>
+        <w:t>високорівневий</w:t>
+      </w:r>
+      <w:proofErr w:type="spellEnd"/>
+      <w:r>
+        <w:rPr>
+          <w:rFonts w:eastAsia="Arial Unicode MS" w:cs="Times New Roman"/>
+          <w:bCs/>
+          <w:color w:val="000000"/>
+          <w:szCs w:val="28"/>
+          <w:u w:color="000000"/>
+          <w:bdr w:val="nil"/>
+          <w:lang w:val="uk-UA" w:eastAsia="ru-RU"/>
+        </w:rPr>
+        <w:t xml:space="preserve"> інтерфейс </w:t>
+      </w:r>
+      <w:proofErr w:type="spellStart"/>
+      <w:r>
+        <w:rPr>
+          <w:rFonts w:eastAsia="Arial Unicode MS" w:cs="Times New Roman"/>
+          <w:bCs/>
+          <w:color w:val="000000"/>
+          <w:szCs w:val="28"/>
+          <w:u w:color="000000"/>
+          <w:bdr w:val="nil"/>
+          <w:lang w:val="uk-UA" w:eastAsia="ru-RU"/>
+        </w:rPr>
+        <w:t>ThreadPoolExecutor</w:t>
+      </w:r>
+      <w:proofErr w:type="spellEnd"/>
+      <w:r>
+        <w:rPr>
+          <w:rFonts w:eastAsia="Arial Unicode MS" w:cs="Times New Roman"/>
+          <w:bCs/>
+          <w:color w:val="000000"/>
+          <w:szCs w:val="28"/>
+          <w:u w:color="000000"/>
+          <w:bdr w:val="nil"/>
+          <w:lang w:val="uk-UA" w:eastAsia="ru-RU"/>
+        </w:rPr>
+        <w:t xml:space="preserve"> і </w:t>
+      </w:r>
+      <w:proofErr w:type="spellStart"/>
+      <w:r>
+        <w:rPr>
+          <w:rFonts w:eastAsia="Arial Unicode MS" w:cs="Times New Roman"/>
+          <w:bCs/>
+          <w:color w:val="000000"/>
+          <w:szCs w:val="28"/>
+          <w:u w:color="000000"/>
+          <w:bdr w:val="nil"/>
+          <w:lang w:val="uk-UA" w:eastAsia="ru-RU"/>
+        </w:rPr>
+        <w:t>ProcessPoolExecutor</w:t>
+      </w:r>
+      <w:proofErr w:type="spellEnd"/>
+      <w:r>
+        <w:rPr>
+          <w:rFonts w:eastAsia="Arial Unicode MS" w:cs="Times New Roman"/>
+          <w:bCs/>
+          <w:color w:val="000000"/>
+          <w:szCs w:val="28"/>
+          <w:u w:color="000000"/>
+          <w:bdr w:val="nil"/>
+          <w:lang w:val="uk-UA" w:eastAsia="ru-RU"/>
+        </w:rPr>
+        <w:t xml:space="preserve"> для запуску задач у потоках або процесах. Перевага цього підходу полягає в простішому програмному інтерфейсі й уніфікованій роботі з пулом виконавців. Проте в межах цієї роботи важливо не лише запускати паралельні задачі, а й мати достатньо явний контроль над процесною моделлю, синхронізацією та організацією спільного доступу до даних. Тому </w:t>
+      </w:r>
+      <w:proofErr w:type="spellStart"/>
+      <w:r>
+        <w:rPr>
+          <w:rFonts w:eastAsia="Arial Unicode MS" w:cs="Times New Roman"/>
+          <w:bCs/>
+          <w:color w:val="000000"/>
+          <w:szCs w:val="28"/>
+          <w:u w:color="000000"/>
+          <w:bdr w:val="nil"/>
+          <w:lang w:val="uk-UA" w:eastAsia="ru-RU"/>
+        </w:rPr>
+        <w:t>concurrent.futures</w:t>
+      </w:r>
+      <w:proofErr w:type="spellEnd"/>
+      <w:r>
+        <w:rPr>
+          <w:rFonts w:eastAsia="Arial Unicode MS" w:cs="Times New Roman"/>
+          <w:bCs/>
+          <w:color w:val="000000"/>
+          <w:szCs w:val="28"/>
+          <w:u w:color="000000"/>
+          <w:bdr w:val="nil"/>
+          <w:lang w:val="uk-UA" w:eastAsia="ru-RU"/>
+        </w:rPr>
+        <w:t xml:space="preserve"> доцільно розглядати як корисну альтернативу, але не як основний інструмент роботи.</w:t>
+      </w:r>
+    </w:p>
+    <w:p>
+      <w:pPr>
+        <w:ind w:firstLine="708"/>
+        <w:rPr>
+          <w:rFonts w:eastAsia="Arial Unicode MS" w:cs="Times New Roman"/>
+          <w:bCs/>
+          <w:color w:val="000000"/>
+          <w:szCs w:val="28"/>
+          <w:u w:color="000000"/>
+          <w:bdr w:val="nil"/>
+          <w:lang w:val="uk-UA" w:eastAsia="ru-RU"/>
+        </w:rPr>
+      </w:pPr>
+    </w:p>
+    <w:p>
+      <w:pPr>
+        <w:ind w:firstLine="708"/>
+        <w:rPr>
+          <w:rFonts w:eastAsia="Arial Unicode MS" w:cs="Times New Roman"/>
+          <w:bCs/>
+          <w:color w:val="000000"/>
+          <w:szCs w:val="28"/>
+          <w:u w:color="000000"/>
+          <w:bdr w:val="nil"/>
+          <w:lang w:val="uk-UA" w:eastAsia="ru-RU"/>
+        </w:rPr>
+      </w:pPr>
+      <w:r>
+        <w:rPr>
+          <w:rFonts w:eastAsia="Arial Unicode MS" w:cs="Times New Roman"/>
+          <w:bCs/>
+          <w:color w:val="000000"/>
+          <w:szCs w:val="28"/>
+          <w:u w:color="000000"/>
+          <w:bdr w:val="nil"/>
+          <w:lang w:val="uk-UA" w:eastAsia="ru-RU"/>
+        </w:rPr>
+        <w:t xml:space="preserve">Таблиця 3.1 – </w:t>
+      </w:r>
+      <w:r>
+        <w:rPr>
+          <w:rFonts w:eastAsia="Arial Unicode MS" w:cs="Times New Roman"/>
+          <w:bCs/>
+          <w:color w:val="000000"/>
+          <w:szCs w:val="28"/>
+          <w:u w:color="000000"/>
+          <w:bdr w:val="nil"/>
+          <w:lang w:val="uk-UA" w:eastAsia="ru-RU"/>
+        </w:rPr>
+        <w:t xml:space="preserve">Порівняння засобів організації паралельних обчислень у </w:t>
+      </w:r>
+      <w:proofErr w:type="spellStart"/>
+      <w:r>
+        <w:rPr>
+          <w:rFonts w:eastAsia="Arial Unicode MS" w:cs="Times New Roman"/>
+          <w:bCs/>
+          <w:color w:val="000000"/>
+          <w:szCs w:val="28"/>
+          <w:u w:color="000000"/>
+          <w:bdr w:val="nil"/>
+          <w:lang w:val="uk-UA" w:eastAsia="ru-RU"/>
+        </w:rPr>
+        <w:t>Python</w:t>
+      </w:r>
+      <w:proofErr w:type="spellEnd"/>
+    </w:p>
+    <w:tbl>
+      <w:tblPr>
+        <w:tblW w:w="9616" w:type="dxa"/>
+        <w:tblBorders>
+          <w:top w:val="single" w:sz="4" w:space="0" w:color="auto"/>
+          <w:left w:val="single" w:sz="4" w:space="0" w:color="auto"/>
+          <w:bottom w:val="single" w:sz="4" w:space="0" w:color="auto"/>
+          <w:right w:val="single" w:sz="4" w:space="0" w:color="auto"/>
+          <w:insideH w:val="single" w:sz="4" w:space="0" w:color="auto"/>
+          <w:insideV w:val="single" w:sz="4" w:space="0" w:color="auto"/>
+        </w:tblBorders>
+        <w:tblLayout w:type="fixed"/>
+        <w:tblCellMar>
+          <w:top w:w="15" w:type="dxa"/>
+          <w:left w:w="15" w:type="dxa"/>
+          <w:bottom w:w="15" w:type="dxa"/>
+          <w:right w:w="15" w:type="dxa"/>
+        </w:tblCellMar>
+        <w:tblLook w:val="04A0" w:firstRow="1" w:lastRow="0" w:firstColumn="1" w:lastColumn="0" w:noHBand="0" w:noVBand="1"/>
+      </w:tblPr>
+      <w:tblGrid>
+        <w:gridCol w:w="1838"/>
+        <w:gridCol w:w="1985"/>
+        <w:gridCol w:w="2409"/>
+        <w:gridCol w:w="1985"/>
+        <w:gridCol w:w="1399"/>
+      </w:tblGrid>
+      <w:tr>
+        <w:trPr>
+          <w:tblHeader/>
+        </w:trPr>
+        <w:tc>
+          <w:tcPr>
+            <w:tcW w:w="1838" w:type="dxa"/>
+            <w:vAlign w:val="center"/>
+            <w:hideMark/>
+          </w:tcPr>
+          <w:p>
+            <w:pPr>
+              <w:ind w:firstLine="0"/>
+              <w:jc w:val="center"/>
+              <w:rPr>
+                <w:rFonts w:eastAsia="Times New Roman" w:cs="Times New Roman"/>
+                <w:b/>
+                <w:bCs/>
+                <w:szCs w:val="28"/>
+                <w:lang w:val="en-US" w:eastAsia="en-GB"/>
+              </w:rPr>
+            </w:pPr>
+            <w:proofErr w:type="spellStart"/>
+            <w:r>
+              <w:rPr>
+                <w:rFonts w:eastAsia="Times New Roman" w:cs="Times New Roman"/>
+                <w:b/>
+                <w:bCs/>
+                <w:szCs w:val="28"/>
+                <w:lang w:val="en-US" w:eastAsia="en-GB"/>
+              </w:rPr>
+              <w:t>Засіб</w:t>
+            </w:r>
+            <w:proofErr w:type="spellEnd"/>
+          </w:p>
+        </w:tc>
+        <w:tc>
+          <w:tcPr>
+            <w:tcW w:w="1985" w:type="dxa"/>
+            <w:vAlign w:val="center"/>
+            <w:hideMark/>
+          </w:tcPr>
+          <w:p>
+            <w:pPr>
+              <w:ind w:firstLine="0"/>
+              <w:jc w:val="center"/>
+              <w:rPr>
+                <w:rFonts w:eastAsia="Times New Roman" w:cs="Times New Roman"/>
+                <w:b/>
+                <w:bCs/>
+                <w:szCs w:val="28"/>
+                <w:lang w:val="en-UA" w:eastAsia="en-GB"/>
+              </w:rPr>
+            </w:pPr>
+            <w:r>
+              <w:rPr>
+                <w:rFonts w:eastAsia="Times New Roman" w:cs="Times New Roman"/>
+                <w:b/>
+                <w:bCs/>
+                <w:szCs w:val="28"/>
+                <w:lang w:val="en-UA" w:eastAsia="en-GB"/>
+              </w:rPr>
+              <w:t>Коротка характеристика</w:t>
+            </w:r>
+          </w:p>
+        </w:tc>
+        <w:tc>
+          <w:tcPr>
+            <w:tcW w:w="2409" w:type="dxa"/>
+            <w:vAlign w:val="center"/>
+            <w:hideMark/>
+          </w:tcPr>
+          <w:p>
+            <w:pPr>
+              <w:ind w:firstLine="0"/>
+              <w:jc w:val="center"/>
+              <w:rPr>
+                <w:rFonts w:eastAsia="Times New Roman" w:cs="Times New Roman"/>
+                <w:b/>
+                <w:bCs/>
+                <w:szCs w:val="28"/>
+                <w:lang w:val="en-UA" w:eastAsia="en-GB"/>
+              </w:rPr>
+            </w:pPr>
+            <w:r>
+              <w:rPr>
+                <w:rFonts w:eastAsia="Times New Roman" w:cs="Times New Roman"/>
+                <w:b/>
+                <w:bCs/>
+                <w:szCs w:val="28"/>
+                <w:lang w:val="en-UA" w:eastAsia="en-GB"/>
+              </w:rPr>
+              <w:t>Переваги</w:t>
+            </w:r>
+          </w:p>
+        </w:tc>
+        <w:tc>
+          <w:tcPr>
+            <w:tcW w:w="1985" w:type="dxa"/>
+            <w:vAlign w:val="center"/>
+            <w:hideMark/>
+          </w:tcPr>
+          <w:p>
+            <w:pPr>
+              <w:ind w:firstLine="0"/>
+              <w:jc w:val="center"/>
+              <w:rPr>
+                <w:rFonts w:eastAsia="Times New Roman" w:cs="Times New Roman"/>
+                <w:b/>
+                <w:bCs/>
+                <w:szCs w:val="28"/>
+                <w:lang w:val="en-UA" w:eastAsia="en-GB"/>
+              </w:rPr>
+            </w:pPr>
+            <w:r>
+              <w:rPr>
+                <w:rFonts w:eastAsia="Times New Roman" w:cs="Times New Roman"/>
+                <w:b/>
+                <w:bCs/>
+                <w:szCs w:val="28"/>
+                <w:lang w:val="en-UA" w:eastAsia="en-GB"/>
+              </w:rPr>
+              <w:t>Обмеження</w:t>
+            </w:r>
+          </w:p>
+        </w:tc>
+        <w:tc>
+          <w:tcPr>
+            <w:tcW w:w="1399" w:type="dxa"/>
+            <w:vAlign w:val="center"/>
+            <w:hideMark/>
+          </w:tcPr>
+          <w:p>
+            <w:pPr>
+              <w:ind w:firstLine="0"/>
+              <w:jc w:val="center"/>
+              <w:rPr>
+                <w:rFonts w:eastAsia="Times New Roman" w:cs="Times New Roman"/>
+                <w:b/>
+                <w:bCs/>
+                <w:szCs w:val="28"/>
+                <w:lang w:val="en-UA" w:eastAsia="en-GB"/>
+              </w:rPr>
+            </w:pPr>
+            <w:r>
+              <w:rPr>
+                <w:rFonts w:eastAsia="Times New Roman" w:cs="Times New Roman"/>
+                <w:b/>
+                <w:bCs/>
+                <w:szCs w:val="28"/>
+                <w:lang w:val="en-UA" w:eastAsia="en-GB"/>
+              </w:rPr>
+              <w:t>Висновок для роботи</w:t>
+            </w:r>
+          </w:p>
+        </w:tc>
+      </w:tr>
+      <w:tr>
+        <w:tc>
+          <w:tcPr>
+            <w:tcW w:w="1838" w:type="dxa"/>
+            <w:vAlign w:val="center"/>
+            <w:hideMark/>
+          </w:tcPr>
+          <w:p>
+            <w:pPr>
+              <w:ind w:firstLine="0"/>
+              <w:jc w:val="left"/>
+              <w:rPr>
+                <w:rFonts w:eastAsia="Times New Roman" w:cs="Times New Roman"/>
+                <w:szCs w:val="28"/>
+                <w:lang w:val="en-UA" w:eastAsia="en-GB"/>
+              </w:rPr>
+            </w:pPr>
+            <w:r>
+              <w:rPr>
+                <w:rFonts w:eastAsia="Times New Roman" w:cs="Times New Roman"/>
+                <w:szCs w:val="28"/>
+                <w:lang w:val="en-UA" w:eastAsia="en-GB"/>
+              </w:rPr>
+              <w:t>multiprocessing</w:t>
+            </w:r>
+          </w:p>
+        </w:tc>
+        <w:tc>
+          <w:tcPr>
+            <w:tcW w:w="1985" w:type="dxa"/>
+            <w:vAlign w:val="center"/>
+            <w:hideMark/>
+          </w:tcPr>
+          <w:p>
+            <w:pPr>
+              <w:ind w:firstLine="0"/>
+              <w:jc w:val="left"/>
+              <w:rPr>
+                <w:rFonts w:eastAsia="Times New Roman" w:cs="Times New Roman"/>
+                <w:szCs w:val="28"/>
+                <w:lang w:val="en-UA" w:eastAsia="en-GB"/>
+              </w:rPr>
+            </w:pPr>
+            <w:r>
+              <w:rPr>
+                <w:rFonts w:eastAsia="Times New Roman" w:cs="Times New Roman"/>
+                <w:szCs w:val="28"/>
+                <w:lang w:val="en-UA" w:eastAsia="en-GB"/>
+              </w:rPr>
+              <w:t>Паралелізм на основі окремих процесів</w:t>
+            </w:r>
+          </w:p>
+        </w:tc>
+        <w:tc>
+          <w:tcPr>
+            <w:tcW w:w="2409" w:type="dxa"/>
+            <w:vAlign w:val="center"/>
+            <w:hideMark/>
+          </w:tcPr>
+          <w:p>
+            <w:pPr>
+              <w:ind w:firstLine="0"/>
+              <w:jc w:val="left"/>
+              <w:rPr>
+                <w:rFonts w:eastAsia="Times New Roman" w:cs="Times New Roman"/>
+                <w:szCs w:val="28"/>
+                <w:lang w:val="en-UA" w:eastAsia="en-GB"/>
+              </w:rPr>
+            </w:pPr>
+            <w:r>
+              <w:rPr>
+                <w:rFonts w:eastAsia="Times New Roman" w:cs="Times New Roman"/>
+                <w:szCs w:val="28"/>
+                <w:lang w:val="en-UA" w:eastAsia="en-GB"/>
+              </w:rPr>
+              <w:t>Використання кількох ядер, Pool, придатність для CPU-bound задач</w:t>
+            </w:r>
+          </w:p>
+        </w:tc>
+        <w:tc>
+          <w:tcPr>
+            <w:tcW w:w="1985" w:type="dxa"/>
+            <w:vAlign w:val="center"/>
+            <w:hideMark/>
+          </w:tcPr>
+          <w:p>
+            <w:pPr>
+              <w:ind w:firstLine="0"/>
+              <w:jc w:val="left"/>
+              <w:rPr>
+                <w:rFonts w:eastAsia="Times New Roman" w:cs="Times New Roman"/>
+                <w:szCs w:val="28"/>
+                <w:lang w:val="en-UA" w:eastAsia="en-GB"/>
+              </w:rPr>
+            </w:pPr>
+            <w:r>
+              <w:rPr>
+                <w:rFonts w:eastAsia="Times New Roman" w:cs="Times New Roman"/>
+                <w:szCs w:val="28"/>
+                <w:lang w:val="en-UA" w:eastAsia="en-GB"/>
+              </w:rPr>
+              <w:t>Вищі накладні витрати на запуск і синхронізацію</w:t>
+            </w:r>
+          </w:p>
+        </w:tc>
+        <w:tc>
+          <w:tcPr>
+            <w:tcW w:w="1399" w:type="dxa"/>
+            <w:vAlign w:val="center"/>
+            <w:hideMark/>
+          </w:tcPr>
+          <w:p>
+            <w:pPr>
+              <w:ind w:firstLine="0"/>
+              <w:jc w:val="left"/>
+              <w:rPr>
+                <w:rFonts w:eastAsia="Times New Roman" w:cs="Times New Roman"/>
+                <w:szCs w:val="28"/>
+                <w:lang w:val="en-UA" w:eastAsia="en-GB"/>
+              </w:rPr>
+            </w:pPr>
+            <w:r>
+              <w:rPr>
+                <w:rFonts w:eastAsia="Times New Roman" w:cs="Times New Roman"/>
+                <w:szCs w:val="28"/>
+                <w:lang w:val="en-UA" w:eastAsia="en-GB"/>
+              </w:rPr>
+              <w:t>Основний інструмент реалізації</w:t>
+            </w:r>
+          </w:p>
+        </w:tc>
+      </w:tr>
+      <w:tr>
+        <w:tc>
+          <w:tcPr>
+            <w:tcW w:w="1838" w:type="dxa"/>
+            <w:vAlign w:val="center"/>
+            <w:hideMark/>
+          </w:tcPr>
+          <w:p>
+            <w:pPr>
+              <w:ind w:firstLine="0"/>
+              <w:jc w:val="left"/>
+              <w:rPr>
+                <w:rFonts w:eastAsia="Times New Roman" w:cs="Times New Roman"/>
+                <w:szCs w:val="28"/>
+                <w:lang w:val="en-UA" w:eastAsia="en-GB"/>
+              </w:rPr>
+            </w:pPr>
+            <w:r>
+              <w:rPr>
+                <w:rFonts w:eastAsia="Times New Roman" w:cs="Times New Roman"/>
+                <w:szCs w:val="28"/>
+                <w:lang w:val="en-UA" w:eastAsia="en-GB"/>
+              </w:rPr>
+              <w:t>multiprocessing.shared_memory</w:t>
+            </w:r>
+          </w:p>
+        </w:tc>
+        <w:tc>
+          <w:tcPr>
+            <w:tcW w:w="1985" w:type="dxa"/>
+            <w:vAlign w:val="center"/>
+            <w:hideMark/>
+          </w:tcPr>
+          <w:p>
+            <w:pPr>
+              <w:ind w:firstLine="0"/>
+              <w:jc w:val="left"/>
+              <w:rPr>
+                <w:rFonts w:eastAsia="Times New Roman" w:cs="Times New Roman"/>
+                <w:szCs w:val="28"/>
+                <w:lang w:val="en-UA" w:eastAsia="en-GB"/>
+              </w:rPr>
+            </w:pPr>
+            <w:r>
+              <w:rPr>
+                <w:rFonts w:eastAsia="Times New Roman" w:cs="Times New Roman"/>
+                <w:szCs w:val="28"/>
+                <w:lang w:val="en-UA" w:eastAsia="en-GB"/>
+              </w:rPr>
+              <w:t>Спільний буфер пам’яті між процесами</w:t>
+            </w:r>
+          </w:p>
+        </w:tc>
+        <w:tc>
+          <w:tcPr>
+            <w:tcW w:w="2409" w:type="dxa"/>
+            <w:vAlign w:val="center"/>
+            <w:hideMark/>
+          </w:tcPr>
+          <w:p>
+            <w:pPr>
+              <w:ind w:firstLine="0"/>
+              <w:jc w:val="left"/>
+              <w:rPr>
+                <w:rFonts w:eastAsia="Times New Roman" w:cs="Times New Roman"/>
+                <w:szCs w:val="28"/>
+                <w:lang w:val="en-UA" w:eastAsia="en-GB"/>
+              </w:rPr>
+            </w:pPr>
+            <w:r>
+              <w:rPr>
+                <w:rFonts w:eastAsia="Times New Roman" w:cs="Times New Roman"/>
+                <w:szCs w:val="28"/>
+                <w:lang w:val="en-UA" w:eastAsia="en-GB"/>
+              </w:rPr>
+              <w:t>Менше копіювань даних, прямий доступ до масиву</w:t>
+            </w:r>
+          </w:p>
+        </w:tc>
+        <w:tc>
+          <w:tcPr>
+            <w:tcW w:w="1985" w:type="dxa"/>
+            <w:vAlign w:val="center"/>
+            <w:hideMark/>
+          </w:tcPr>
+          <w:p>
+            <w:pPr>
+              <w:ind w:firstLine="0"/>
+              <w:jc w:val="left"/>
+              <w:rPr>
+                <w:rFonts w:eastAsia="Times New Roman" w:cs="Times New Roman"/>
+                <w:szCs w:val="28"/>
+                <w:lang w:val="en-UA" w:eastAsia="en-GB"/>
+              </w:rPr>
+            </w:pPr>
+            <w:r>
+              <w:rPr>
+                <w:rFonts w:eastAsia="Times New Roman" w:cs="Times New Roman"/>
+                <w:szCs w:val="28"/>
+                <w:lang w:val="en-UA" w:eastAsia="en-GB"/>
+              </w:rPr>
+              <w:t xml:space="preserve">Потребує акуратного керування </w:t>
+            </w:r>
+            <w:r>
+              <w:rPr>
+                <w:rFonts w:eastAsia="Times New Roman" w:cs="Times New Roman"/>
+                <w:szCs w:val="28"/>
+                <w:lang w:val="en-UA" w:eastAsia="en-GB"/>
+              </w:rPr>
+              <w:lastRenderedPageBreak/>
+              <w:t>життєвим циклом пам’яті</w:t>
+            </w:r>
+          </w:p>
+        </w:tc>
+        <w:tc>
+          <w:tcPr>
+            <w:tcW w:w="1399" w:type="dxa"/>
+            <w:vAlign w:val="center"/>
+            <w:hideMark/>
+          </w:tcPr>
+          <w:p>
+            <w:pPr>
+              <w:ind w:firstLine="0"/>
+              <w:jc w:val="left"/>
+              <w:rPr>
+                <w:rFonts w:eastAsia="Times New Roman" w:cs="Times New Roman"/>
+                <w:szCs w:val="28"/>
+                <w:lang w:val="en-UA" w:eastAsia="en-GB"/>
+              </w:rPr>
+            </w:pPr>
+            <w:r>
+              <w:rPr>
+                <w:rFonts w:eastAsia="Times New Roman" w:cs="Times New Roman"/>
+                <w:szCs w:val="28"/>
+                <w:lang w:val="en-UA" w:eastAsia="en-GB"/>
+              </w:rPr>
+              <w:lastRenderedPageBreak/>
+              <w:t xml:space="preserve">Ключовий допоміжний механізм </w:t>
+            </w:r>
+            <w:r>
+              <w:rPr>
+                <w:rFonts w:eastAsia="Times New Roman" w:cs="Times New Roman"/>
+                <w:szCs w:val="28"/>
+                <w:lang w:val="en-UA" w:eastAsia="en-GB"/>
+              </w:rPr>
+              <w:lastRenderedPageBreak/>
+              <w:t>поточної реалізації</w:t>
+            </w:r>
+          </w:p>
+        </w:tc>
+      </w:tr>
+      <w:tr>
+        <w:tc>
+          <w:tcPr>
+            <w:tcW w:w="1838" w:type="dxa"/>
+            <w:vAlign w:val="center"/>
+            <w:hideMark/>
+          </w:tcPr>
+          <w:p>
+            <w:pPr>
+              <w:ind w:firstLine="0"/>
+              <w:jc w:val="left"/>
+              <w:rPr>
+                <w:rFonts w:eastAsia="Times New Roman" w:cs="Times New Roman"/>
+                <w:szCs w:val="28"/>
+                <w:lang w:val="en-UA" w:eastAsia="en-GB"/>
+              </w:rPr>
+            </w:pPr>
+            <w:r>
+              <w:rPr>
+                <w:rFonts w:eastAsia="Times New Roman" w:cs="Times New Roman"/>
+                <w:szCs w:val="28"/>
+                <w:lang w:val="en-UA" w:eastAsia="en-GB"/>
+              </w:rPr>
+              <w:lastRenderedPageBreak/>
+              <w:t>threading</w:t>
+            </w:r>
+          </w:p>
+        </w:tc>
+        <w:tc>
+          <w:tcPr>
+            <w:tcW w:w="1985" w:type="dxa"/>
+            <w:vAlign w:val="center"/>
+            <w:hideMark/>
+          </w:tcPr>
+          <w:p>
+            <w:pPr>
+              <w:ind w:firstLine="0"/>
+              <w:jc w:val="left"/>
+              <w:rPr>
+                <w:rFonts w:eastAsia="Times New Roman" w:cs="Times New Roman"/>
+                <w:szCs w:val="28"/>
+                <w:lang w:val="en-UA" w:eastAsia="en-GB"/>
+              </w:rPr>
+            </w:pPr>
+            <w:r>
+              <w:rPr>
+                <w:rFonts w:eastAsia="Times New Roman" w:cs="Times New Roman"/>
+                <w:szCs w:val="28"/>
+                <w:lang w:val="en-UA" w:eastAsia="en-GB"/>
+              </w:rPr>
+              <w:t>Паралельна організація потоків у межах одного процесу</w:t>
+            </w:r>
+          </w:p>
+        </w:tc>
+        <w:tc>
+          <w:tcPr>
+            <w:tcW w:w="2409" w:type="dxa"/>
+            <w:vAlign w:val="center"/>
+            <w:hideMark/>
+          </w:tcPr>
+          <w:p>
+            <w:pPr>
+              <w:ind w:firstLine="0"/>
+              <w:jc w:val="left"/>
+              <w:rPr>
+                <w:rFonts w:eastAsia="Times New Roman" w:cs="Times New Roman"/>
+                <w:szCs w:val="28"/>
+                <w:lang w:val="en-UA" w:eastAsia="en-GB"/>
+              </w:rPr>
+            </w:pPr>
+            <w:r>
+              <w:rPr>
+                <w:rFonts w:eastAsia="Times New Roman" w:cs="Times New Roman"/>
+                <w:szCs w:val="28"/>
+                <w:lang w:val="en-UA" w:eastAsia="en-GB"/>
+              </w:rPr>
+              <w:t>Простота запуску, спільна пам’ять</w:t>
+            </w:r>
+          </w:p>
+        </w:tc>
+        <w:tc>
+          <w:tcPr>
+            <w:tcW w:w="1985" w:type="dxa"/>
+            <w:vAlign w:val="center"/>
+            <w:hideMark/>
+          </w:tcPr>
+          <w:p>
+            <w:pPr>
+              <w:ind w:firstLine="0"/>
+              <w:jc w:val="left"/>
+              <w:rPr>
+                <w:rFonts w:eastAsia="Times New Roman" w:cs="Times New Roman"/>
+                <w:szCs w:val="28"/>
+                <w:lang w:val="en-UA" w:eastAsia="en-GB"/>
+              </w:rPr>
+            </w:pPr>
+            <w:r>
+              <w:rPr>
+                <w:rFonts w:eastAsia="Times New Roman" w:cs="Times New Roman"/>
+                <w:szCs w:val="28"/>
+                <w:lang w:val="en-UA" w:eastAsia="en-GB"/>
+              </w:rPr>
+              <w:t>Обмеження GIL для CPU-bound задач</w:t>
+            </w:r>
+          </w:p>
+        </w:tc>
+        <w:tc>
+          <w:tcPr>
+            <w:tcW w:w="1399" w:type="dxa"/>
+            <w:vAlign w:val="center"/>
+            <w:hideMark/>
+          </w:tcPr>
+          <w:p>
+            <w:pPr>
+              <w:ind w:firstLine="0"/>
+              <w:jc w:val="left"/>
+              <w:rPr>
+                <w:rFonts w:eastAsia="Times New Roman" w:cs="Times New Roman"/>
+                <w:szCs w:val="28"/>
+                <w:lang w:val="en-UA" w:eastAsia="en-GB"/>
+              </w:rPr>
+            </w:pPr>
+            <w:r>
+              <w:rPr>
+                <w:rFonts w:eastAsia="Times New Roman" w:cs="Times New Roman"/>
+                <w:szCs w:val="28"/>
+                <w:lang w:val="en-UA" w:eastAsia="en-GB"/>
+              </w:rPr>
+              <w:t>Не обрано як базовий механізм</w:t>
+            </w:r>
+          </w:p>
+        </w:tc>
+      </w:tr>
+      <w:tr>
+        <w:tc>
+          <w:tcPr>
+            <w:tcW w:w="1838" w:type="dxa"/>
+            <w:vAlign w:val="center"/>
+            <w:hideMark/>
+          </w:tcPr>
+          <w:p>
+            <w:pPr>
+              <w:ind w:firstLine="0"/>
+              <w:jc w:val="left"/>
+              <w:rPr>
+                <w:rFonts w:eastAsia="Times New Roman" w:cs="Times New Roman"/>
+                <w:szCs w:val="28"/>
+                <w:lang w:val="en-UA" w:eastAsia="en-GB"/>
+              </w:rPr>
+            </w:pPr>
+            <w:r>
+              <w:rPr>
+                <w:rFonts w:eastAsia="Times New Roman" w:cs="Times New Roman"/>
+                <w:szCs w:val="28"/>
+                <w:lang w:val="en-UA" w:eastAsia="en-GB"/>
+              </w:rPr>
+              <w:t>concurrent.futures</w:t>
+            </w:r>
+          </w:p>
+        </w:tc>
+        <w:tc>
+          <w:tcPr>
+            <w:tcW w:w="1985" w:type="dxa"/>
+            <w:vAlign w:val="center"/>
+            <w:hideMark/>
+          </w:tcPr>
+          <w:p>
+            <w:pPr>
+              <w:ind w:firstLine="0"/>
+              <w:jc w:val="left"/>
+              <w:rPr>
+                <w:rFonts w:eastAsia="Times New Roman" w:cs="Times New Roman"/>
+                <w:szCs w:val="28"/>
+                <w:lang w:val="en-UA" w:eastAsia="en-GB"/>
+              </w:rPr>
+            </w:pPr>
+            <w:r>
+              <w:rPr>
+                <w:rFonts w:eastAsia="Times New Roman" w:cs="Times New Roman"/>
+                <w:szCs w:val="28"/>
+                <w:lang w:val="en-UA" w:eastAsia="en-GB"/>
+              </w:rPr>
+              <w:t>Високорівневий інтерфейс до пулів потоків і процесів</w:t>
+            </w:r>
+          </w:p>
+        </w:tc>
+        <w:tc>
+          <w:tcPr>
+            <w:tcW w:w="2409" w:type="dxa"/>
+            <w:vAlign w:val="center"/>
+            <w:hideMark/>
+          </w:tcPr>
+          <w:p>
+            <w:pPr>
+              <w:ind w:firstLine="0"/>
+              <w:jc w:val="left"/>
+              <w:rPr>
+                <w:rFonts w:eastAsia="Times New Roman" w:cs="Times New Roman"/>
+                <w:szCs w:val="28"/>
+                <w:lang w:val="en-UA" w:eastAsia="en-GB"/>
+              </w:rPr>
+            </w:pPr>
+            <w:r>
+              <w:rPr>
+                <w:rFonts w:eastAsia="Times New Roman" w:cs="Times New Roman"/>
+                <w:szCs w:val="28"/>
+                <w:lang w:val="en-UA" w:eastAsia="en-GB"/>
+              </w:rPr>
+              <w:t>Простий API, зручне подання задач</w:t>
+            </w:r>
+          </w:p>
+        </w:tc>
+        <w:tc>
+          <w:tcPr>
+            <w:tcW w:w="1985" w:type="dxa"/>
+            <w:vAlign w:val="center"/>
+            <w:hideMark/>
+          </w:tcPr>
+          <w:p>
+            <w:pPr>
+              <w:ind w:firstLine="0"/>
+              <w:jc w:val="left"/>
+              <w:rPr>
+                <w:rFonts w:eastAsia="Times New Roman" w:cs="Times New Roman"/>
+                <w:szCs w:val="28"/>
+                <w:lang w:val="en-UA" w:eastAsia="en-GB"/>
+              </w:rPr>
+            </w:pPr>
+            <w:r>
+              <w:rPr>
+                <w:rFonts w:eastAsia="Times New Roman" w:cs="Times New Roman"/>
+                <w:szCs w:val="28"/>
+                <w:lang w:val="en-UA" w:eastAsia="en-GB"/>
+              </w:rPr>
+              <w:t>Менше контролю над низькорівневою організацією обчислень</w:t>
+            </w:r>
+          </w:p>
+        </w:tc>
+        <w:tc>
+          <w:tcPr>
+            <w:tcW w:w="1399" w:type="dxa"/>
+            <w:vAlign w:val="center"/>
+            <w:hideMark/>
+          </w:tcPr>
+          <w:p>
+            <w:pPr>
+              <w:ind w:firstLine="0"/>
+              <w:jc w:val="left"/>
+              <w:rPr>
+                <w:rFonts w:eastAsia="Times New Roman" w:cs="Times New Roman"/>
+                <w:szCs w:val="28"/>
+                <w:lang w:val="en-UA" w:eastAsia="en-GB"/>
+              </w:rPr>
+            </w:pPr>
+            <w:r>
+              <w:rPr>
+                <w:rFonts w:eastAsia="Times New Roman" w:cs="Times New Roman"/>
+                <w:szCs w:val="28"/>
+                <w:lang w:val="en-UA" w:eastAsia="en-GB"/>
+              </w:rPr>
+              <w:t>Розглянуто як альтернативу</w:t>
+            </w:r>
+          </w:p>
+        </w:tc>
+      </w:tr>
+    </w:tbl>
+    <w:p>
+      <w:pPr>
+        <w:spacing w:line="240" w:lineRule="auto"/>
+        <w:ind w:firstLine="0"/>
+        <w:jc w:val="left"/>
+        <w:rPr>
+          <w:rFonts w:eastAsia="Times New Roman" w:cs="Times New Roman"/>
+          <w:sz w:val="24"/>
+          <w:szCs w:val="24"/>
+          <w:lang w:val="en-UA" w:eastAsia="en-GB"/>
+        </w:rPr>
+      </w:pPr>
+    </w:p>
+    <w:p>
+      <w:pPr>
+        <w:ind w:firstLine="708"/>
+        <w:rPr>
+          <w:rFonts w:eastAsia="Arial Unicode MS" w:cs="Times New Roman"/>
+          <w:bCs/>
+          <w:color w:val="000000"/>
+          <w:szCs w:val="28"/>
+          <w:u w:color="000000"/>
+          <w:bdr w:val="nil"/>
+          <w:lang w:val="uk-UA" w:eastAsia="ru-RU"/>
+        </w:rPr>
+      </w:pPr>
+    </w:p>
+    <w:p>
+      <w:pPr>
+        <w:pStyle w:val="Heading2"/>
+        <w:rPr>
+          <w:lang w:val="uk-UA"/>
+        </w:rPr>
+      </w:pPr>
+      <w:r>
+        <w:rPr>
+          <w:lang w:val="uk-UA"/>
+        </w:rPr>
+        <w:t>3</w:t>
+      </w:r>
+      <w:r>
+        <w:t>.</w:t>
+      </w:r>
+      <w:r>
+        <w:rPr>
+          <w:lang w:val="uk-UA"/>
+        </w:rPr>
+        <w:t>3</w:t>
+      </w:r>
+      <w:r>
+        <w:t xml:space="preserve"> </w:t>
+      </w:r>
+      <w:r>
+        <w:rPr>
+          <w:lang w:val="uk-UA"/>
+        </w:rPr>
+        <w:t>Обґрунтування вибору для цієї задачі</w:t>
+      </w:r>
+    </w:p>
+    <w:p>
+      <w:pPr>
+        <w:rPr>
+          <w:lang w:val="uk-UA"/>
+        </w:rPr>
+      </w:pPr>
+      <w:r>
+        <w:rPr>
+          <w:lang w:val="uk-UA"/>
+        </w:rPr>
+        <w:t xml:space="preserve">Алгоритм </w:t>
+      </w:r>
+      <w:proofErr w:type="spellStart"/>
+      <w:r>
+        <w:rPr>
+          <w:lang w:val="uk-UA"/>
+        </w:rPr>
+        <w:t>бітонічного</w:t>
+      </w:r>
+      <w:proofErr w:type="spellEnd"/>
+      <w:r>
+        <w:rPr>
+          <w:lang w:val="uk-UA"/>
+        </w:rPr>
+        <w:t xml:space="preserve"> сортування має регулярну структуру, у якій значна частина операцій може виконуватися незалежно. Разом з тим між окремими етапами обчислень потрібне узгодження, щоб зберігалася правильна послідовність перетворень даних. Отже, для цієї задачі потрібен інструмент, який дозволяє використовувати кілька </w:t>
+      </w:r>
+      <w:proofErr w:type="spellStart"/>
+      <w:r>
+        <w:rPr>
+          <w:lang w:val="uk-UA"/>
+        </w:rPr>
+        <w:t>ядер</w:t>
+      </w:r>
+      <w:proofErr w:type="spellEnd"/>
+      <w:r>
+        <w:rPr>
+          <w:lang w:val="uk-UA"/>
+        </w:rPr>
+        <w:t xml:space="preserve"> процесора, ділити роботу на </w:t>
+      </w:r>
+      <w:proofErr w:type="spellStart"/>
+      <w:r>
+        <w:rPr>
+          <w:lang w:val="uk-UA"/>
+        </w:rPr>
+        <w:t>підзадачі</w:t>
+      </w:r>
+      <w:proofErr w:type="spellEnd"/>
+      <w:r>
+        <w:rPr>
+          <w:lang w:val="uk-UA"/>
+        </w:rPr>
+        <w:t xml:space="preserve"> та підтримувати контрольований обмін даними між виконавцями.</w:t>
+      </w:r>
+    </w:p>
+    <w:p>
+      <w:pPr>
+        <w:rPr>
+          <w:lang w:val="uk-UA"/>
+        </w:rPr>
+      </w:pPr>
+      <w:r>
+        <w:rPr>
+          <w:lang w:val="uk-UA"/>
+        </w:rPr>
+        <w:t xml:space="preserve">Саме цим вимогам найкраще відповідає зв’язка </w:t>
+      </w:r>
+      <w:proofErr w:type="spellStart"/>
+      <w:r>
+        <w:rPr>
+          <w:lang w:val="uk-UA"/>
+        </w:rPr>
+        <w:t>multiprocessing</w:t>
+      </w:r>
+      <w:proofErr w:type="spellEnd"/>
+      <w:r>
+        <w:rPr>
+          <w:lang w:val="uk-UA"/>
+        </w:rPr>
+        <w:t xml:space="preserve"> + </w:t>
+      </w:r>
+      <w:proofErr w:type="spellStart"/>
+      <w:r>
+        <w:rPr>
+          <w:lang w:val="uk-UA"/>
+        </w:rPr>
+        <w:t>multiprocessing.shared_memory</w:t>
+      </w:r>
+      <w:proofErr w:type="spellEnd"/>
+      <w:r>
+        <w:rPr>
+          <w:lang w:val="uk-UA"/>
+        </w:rPr>
+        <w:t xml:space="preserve">. Вона поєднує справжній процесний паралелізм із можливістю організувати спільний доступ до даних без переходу до зовнішніх платформ або спеціалізованих </w:t>
+      </w:r>
+      <w:proofErr w:type="spellStart"/>
+      <w:r>
+        <w:rPr>
+          <w:lang w:val="uk-UA"/>
+        </w:rPr>
+        <w:t>фреймворків</w:t>
+      </w:r>
+      <w:proofErr w:type="spellEnd"/>
+      <w:r>
+        <w:rPr>
+          <w:lang w:val="uk-UA"/>
+        </w:rPr>
+        <w:t xml:space="preserve">. </w:t>
+      </w:r>
+      <w:r>
+        <w:rPr>
+          <w:lang w:val="uk-UA"/>
+        </w:rPr>
+        <w:t>Ц</w:t>
+      </w:r>
+      <w:r>
+        <w:rPr>
+          <w:lang w:val="uk-UA"/>
+        </w:rPr>
+        <w:t xml:space="preserve">е є важливою перевагою, оскільки обрані засоби входять до стандартної бібліотеки </w:t>
+      </w:r>
+      <w:proofErr w:type="spellStart"/>
+      <w:r>
+        <w:rPr>
+          <w:lang w:val="uk-UA"/>
+        </w:rPr>
+        <w:t>Python</w:t>
+      </w:r>
+      <w:proofErr w:type="spellEnd"/>
+      <w:r>
+        <w:rPr>
+          <w:lang w:val="uk-UA"/>
+        </w:rPr>
+        <w:t>, добре документовані та достатні для побудови й дослідження паралельного алгоритму на багатоядерному CPU.</w:t>
+      </w:r>
+    </w:p>
+    <w:p>
+      <w:pPr>
+        <w:rPr>
+          <w:lang w:val="uk-UA"/>
+        </w:rPr>
+      </w:pPr>
+      <w:r>
+        <w:rPr>
+          <w:lang w:val="uk-UA"/>
+        </w:rPr>
+        <w:lastRenderedPageBreak/>
+        <w:t xml:space="preserve">Отже, для даної курсової роботи вибір </w:t>
+      </w:r>
+      <w:proofErr w:type="spellStart"/>
+      <w:r>
+        <w:rPr>
+          <w:lang w:val="uk-UA"/>
+        </w:rPr>
+        <w:t>Python</w:t>
+      </w:r>
+      <w:proofErr w:type="spellEnd"/>
+      <w:r>
+        <w:rPr>
+          <w:lang w:val="uk-UA"/>
+        </w:rPr>
+        <w:t xml:space="preserve"> як мови реалізації, </w:t>
+      </w:r>
+      <w:proofErr w:type="spellStart"/>
+      <w:r>
+        <w:rPr>
+          <w:lang w:val="uk-UA"/>
+        </w:rPr>
+        <w:t>multiprocessing</w:t>
+      </w:r>
+      <w:proofErr w:type="spellEnd"/>
+      <w:r>
+        <w:rPr>
+          <w:lang w:val="uk-UA"/>
+        </w:rPr>
+        <w:t xml:space="preserve"> як основного механізму паралелізації та </w:t>
+      </w:r>
+      <w:proofErr w:type="spellStart"/>
+      <w:r>
+        <w:rPr>
+          <w:lang w:val="uk-UA"/>
+        </w:rPr>
+        <w:t>multiprocessing.shared_memory</w:t>
+      </w:r>
+      <w:proofErr w:type="spellEnd"/>
+      <w:r>
+        <w:rPr>
+          <w:lang w:val="uk-UA"/>
+        </w:rPr>
+        <w:t xml:space="preserve"> як засобу спільного доступу до даних є обґрунтованим. Модулі </w:t>
+      </w:r>
+      <w:proofErr w:type="spellStart"/>
+      <w:r>
+        <w:rPr>
+          <w:lang w:val="uk-UA"/>
+        </w:rPr>
+        <w:t>threading</w:t>
+      </w:r>
+      <w:proofErr w:type="spellEnd"/>
+      <w:r>
+        <w:rPr>
+          <w:lang w:val="uk-UA"/>
+        </w:rPr>
+        <w:t xml:space="preserve"> і </w:t>
+      </w:r>
+      <w:proofErr w:type="spellStart"/>
+      <w:r>
+        <w:rPr>
+          <w:lang w:val="uk-UA"/>
+        </w:rPr>
+        <w:t>concurrent.futures</w:t>
+      </w:r>
+      <w:proofErr w:type="spellEnd"/>
+      <w:r>
+        <w:rPr>
+          <w:lang w:val="uk-UA"/>
+        </w:rPr>
+        <w:t xml:space="preserve"> розглядаються як корисні альтернативи, однак для CPU-</w:t>
+      </w:r>
+      <w:proofErr w:type="spellStart"/>
+      <w:r>
+        <w:rPr>
+          <w:lang w:val="uk-UA"/>
+        </w:rPr>
+        <w:t>bound</w:t>
+      </w:r>
+      <w:proofErr w:type="spellEnd"/>
+      <w:r>
+        <w:rPr>
+          <w:lang w:val="uk-UA"/>
+        </w:rPr>
+        <w:t xml:space="preserve"> сортування великих масивів вони або поступаються за практичною придатністю, або менш точно відповідають вимогам задачі.</w:t>
+      </w:r>
+    </w:p>
+    <w:p>
+      <w:pPr>
+        <w:rPr>
+          <w:lang w:val="uk-UA"/>
+        </w:rPr>
+      </w:pPr>
+    </w:p>
+    <w:p>
+      <w:pPr>
+        <w:ind w:firstLine="708"/>
+        <w:rPr>
+          <w:rFonts w:eastAsia="Arial Unicode MS" w:cs="Times New Roman"/>
+          <w:bCs/>
+          <w:color w:val="000000"/>
+          <w:szCs w:val="28"/>
+          <w:u w:color="000000"/>
+          <w:bdr w:val="nil"/>
+          <w:lang w:val="uk-UA" w:eastAsia="ru-RU"/>
+        </w:rPr>
+      </w:pPr>
+    </w:p>
+    <w:p>
+      <w:pPr>
+        <w:ind w:firstLine="708"/>
+        <w:rPr>
+          <w:rFonts w:eastAsia="Arial Unicode MS" w:cs="Times New Roman"/>
+          <w:bCs/>
+          <w:color w:val="000000"/>
+          <w:szCs w:val="28"/>
+          <w:u w:color="000000"/>
+          <w:bdr w:val="nil"/>
+          <w:lang w:val="uk-UA" w:eastAsia="ru-RU"/>
+        </w:rPr>
+      </w:pPr>
+      <w:r>
+        <w:rPr>
+          <w:rFonts w:eastAsia="Arial Unicode MS" w:cs="Times New Roman"/>
+          <w:bCs/>
+          <w:color w:val="000000"/>
+          <w:szCs w:val="28"/>
+          <w:u w:color="000000"/>
+          <w:bdr w:val="nil"/>
+          <w:lang w:val="uk-UA" w:eastAsia="ru-RU"/>
+        </w:rPr>
+        <w:br w:type="page"/>
+      </w:r>
+    </w:p>
+    <w:p>
+      <w:pPr>
         <w:pStyle w:val="Heading1"/>
         <w:spacing w:before="0"/>
         <w:rPr>
@@ -18312,7 +20275,146 @@
           <w:lang w:val="uk-UA" w:eastAsia="ru-RU"/>
         </w:rPr>
       </w:pPr>
-      <w:bookmarkStart w:id="17" w:name="_Toc224694571"/>
+      <w:bookmarkStart w:id="19" w:name="_Toc224694570"/>
+      <w:r>
+        <w:rPr>
+          <w:rFonts w:eastAsia="Arial Unicode MS" w:cs="Times New Roman"/>
+          <w:bCs/>
+          <w:color w:val="000000"/>
+          <w:szCs w:val="28"/>
+          <w:u w:color="000000"/>
+          <w:bdr w:val="nil"/>
+          <w:lang w:val="uk-UA" w:eastAsia="ru-RU"/>
+        </w:rPr>
+        <w:lastRenderedPageBreak/>
+        <w:t>4</w:t>
+      </w:r>
+      <w:r>
+        <w:rPr>
+          <w:rFonts w:eastAsia="Arial Unicode MS" w:cs="Times New Roman"/>
+          <w:bCs/>
+          <w:color w:val="000000"/>
+          <w:szCs w:val="28"/>
+          <w:u w:color="000000"/>
+          <w:bdr w:val="nil"/>
+          <w:lang w:val="uk-UA" w:eastAsia="ru-RU"/>
+        </w:rPr>
+        <w:t xml:space="preserve"> </w:t>
+      </w:r>
+      <w:r>
+        <w:rPr>
+          <w:rFonts w:eastAsia="Arial Unicode MS" w:cs="Times New Roman"/>
+          <w:bCs/>
+          <w:color w:val="000000"/>
+          <w:szCs w:val="28"/>
+          <w:u w:color="000000"/>
+          <w:bdr w:val="nil"/>
+          <w:lang w:val="uk-UA" w:eastAsia="ru-RU"/>
+        </w:rPr>
+        <w:t xml:space="preserve">РОЗРОБКА </w:t>
+      </w:r>
+      <w:r>
+        <w:rPr>
+          <w:rFonts w:eastAsia="Arial Unicode MS" w:cs="Times New Roman"/>
+          <w:bCs/>
+          <w:color w:val="000000"/>
+          <w:szCs w:val="28"/>
+          <w:u w:color="000000"/>
+          <w:bdr w:val="nil"/>
+          <w:lang w:val="uk-UA" w:eastAsia="ru-RU"/>
+        </w:rPr>
+        <w:t xml:space="preserve">ПАРАЛЕЛЬНОГО АЛГОРИТМУ </w:t>
+      </w:r>
+      <w:r>
+        <w:rPr>
+          <w:rFonts w:eastAsia="Arial Unicode MS" w:cs="Times New Roman"/>
+          <w:bCs/>
+          <w:color w:val="000000"/>
+          <w:szCs w:val="28"/>
+          <w:u w:color="000000"/>
+          <w:bdr w:val="nil"/>
+          <w:lang w:val="uk-UA" w:eastAsia="ru-RU"/>
+        </w:rPr>
+        <w:t>З ВИКОРИСТАННЯМ ОБРАНОГО ПРОГРАМНОГО ЗАБЕЗПЕЧЕННЯ: ПРО</w:t>
+      </w:r>
+      <w:r>
+        <w:rPr>
+          <w:rFonts w:eastAsia="Arial Unicode MS" w:cs="Times New Roman"/>
+          <w:b w:val="0"/>
+          <w:bCs/>
+          <w:color w:val="000000"/>
+          <w:szCs w:val="28"/>
+          <w:u w:color="000000"/>
+          <w:bdr w:val="nil"/>
+          <w:lang w:val="uk-UA" w:eastAsia="ru-RU"/>
+        </w:rPr>
+        <w:t>Є</w:t>
+      </w:r>
+      <w:r>
+        <w:rPr>
+          <w:rFonts w:eastAsia="Arial Unicode MS" w:cs="Times New Roman"/>
+          <w:bCs/>
+          <w:color w:val="000000"/>
+          <w:szCs w:val="28"/>
+          <w:u w:color="000000"/>
+          <w:bdr w:val="nil"/>
+          <w:lang w:val="uk-UA" w:eastAsia="ru-RU"/>
+        </w:rPr>
+        <w:t>КТУВАННЯ, РЕАЛІЗАЦІЯ, ТЕСТУВАННЯ</w:t>
+      </w:r>
+      <w:bookmarkEnd w:id="19"/>
+    </w:p>
+    <w:p>
+      <w:pPr>
+        <w:rPr>
+          <w:rFonts w:cs="Times New Roman"/>
+          <w:lang w:val="uk-UA" w:eastAsia="ru-RU"/>
+        </w:rPr>
+      </w:pPr>
+    </w:p>
+    <w:p>
+      <w:pPr>
+        <w:rPr>
+          <w:rFonts w:eastAsia="Arial Unicode MS" w:cs="Times New Roman"/>
+          <w:b/>
+          <w:bCs/>
+          <w:color w:val="000000"/>
+          <w:szCs w:val="28"/>
+          <w:u w:color="000000"/>
+          <w:bdr w:val="nil"/>
+          <w:lang w:val="uk-UA" w:eastAsia="ru-RU"/>
+        </w:rPr>
+      </w:pPr>
+      <w:r>
+        <w:rPr>
+          <w:rFonts w:eastAsia="Arial Unicode MS" w:cs="Times New Roman"/>
+          <w:b/>
+          <w:bCs/>
+          <w:color w:val="000000"/>
+          <w:szCs w:val="28"/>
+          <w:u w:color="000000"/>
+          <w:bdr w:val="nil"/>
+          <w:lang w:val="uk-UA" w:eastAsia="ru-RU"/>
+        </w:rPr>
+        <w:br w:type="page"/>
+      </w:r>
+    </w:p>
+    <w:p>
+      <w:pPr>
+        <w:pStyle w:val="Heading1"/>
+        <w:spacing w:before="0"/>
+        <w:rPr>
+          <w:rFonts w:eastAsia="Arial Unicode MS" w:cs="Times New Roman"/>
+          <w:b w:val="0"/>
+          <w:bCs/>
+          <w:color w:val="000000"/>
+          <w:szCs w:val="28"/>
+          <w:u w:color="000000"/>
+          <w:bdr w:val="nil"/>
+          <w:lang w:val="uk-UA" w:eastAsia="ru-RU"/>
+        </w:rPr>
+      </w:pPr>
+      <w:bookmarkStart w:id="20" w:name="_Toc224694571"/>
       <w:r>
         <w:rPr>
           <w:rFonts w:eastAsia="Arial Unicode MS" w:cs="Times New Roman"/>
@@ -18350,7 +20452,7 @@
         </w:rPr>
         <w:t>ДОСЛІДЖЕННЯ ЕФЕКТИВНОСТІ ПАРАЛЕЛЬНИХ ОБЧИСЛЕНЬ АЛГОРИТМУ</w:t>
       </w:r>
-      <w:bookmarkEnd w:id="17"/>
+      <w:bookmarkEnd w:id="20"/>
     </w:p>
     <w:p>
       <w:pPr>
@@ -19147,7 +21249,7 @@
           <w:lang w:val="uk-UA" w:eastAsia="ru-RU"/>
         </w:rPr>
       </w:pPr>
-      <w:bookmarkStart w:id="18" w:name="_Toc224694572"/>
+      <w:bookmarkStart w:id="21" w:name="_Toc224694572"/>
       <w:r>
         <w:rPr>
           <w:rFonts w:eastAsia="Arial Unicode MS" w:cs="Times New Roman"/>
@@ -19173,7 +21275,7 @@
         </w:rPr>
         <w:t>ВКИ</w:t>
       </w:r>
-      <w:bookmarkEnd w:id="18"/>
+      <w:bookmarkEnd w:id="21"/>
     </w:p>
     <w:p>
       <w:pPr>
@@ -19225,7 +21327,7 @@
           <w:lang w:val="uk-UA" w:eastAsia="ru-RU"/>
         </w:rPr>
       </w:pPr>
-      <w:bookmarkStart w:id="19" w:name="_Toc224694573"/>
+      <w:bookmarkStart w:id="22" w:name="_Toc224694573"/>
       <w:r>
         <w:rPr>
           <w:rFonts w:eastAsia="Arial Unicode MS"/>
@@ -19248,7 +21350,7 @@
         </w:rPr>
         <w:t xml:space="preserve"> ДЖЕРЕЛ</w:t>
       </w:r>
-      <w:bookmarkEnd w:id="19"/>
+      <w:bookmarkEnd w:id="22"/>
     </w:p>
     <w:p>
       <w:pPr>
@@ -19484,7 +21586,7 @@
           <w:lang w:val="uk-UA" w:eastAsia="ru-RU"/>
         </w:rPr>
       </w:pPr>
-      <w:bookmarkStart w:id="20" w:name="_Toc224694574"/>
+      <w:bookmarkStart w:id="23" w:name="_Toc224694574"/>
       <w:r>
         <w:rPr>
           <w:rFonts w:eastAsia="Arial Unicode MS" w:cs="Times New Roman"/>
@@ -19498,7 +21600,7 @@
         <w:lastRenderedPageBreak/>
         <w:t>ДОДАТКИ</w:t>
       </w:r>
-      <w:bookmarkEnd w:id="20"/>
+      <w:bookmarkEnd w:id="23"/>
     </w:p>
     <w:p>
       <w:pPr>
@@ -19515,7 +21617,7 @@
           <w:lang w:val="uk-UA" w:eastAsia="ru-RU"/>
         </w:rPr>
       </w:pPr>
-      <w:bookmarkStart w:id="21" w:name="_Toc224694575"/>
+      <w:bookmarkStart w:id="24" w:name="_Toc224694575"/>
       <w:r>
         <w:rPr>
           <w:rFonts w:eastAsia="Arial Unicode MS" w:cs="Times New Roman"/>
@@ -19568,7 +21670,7 @@
         </w:rPr>
         <w:t>ва додатку</w:t>
       </w:r>
-      <w:bookmarkEnd w:id="21"/>
+      <w:bookmarkEnd w:id="24"/>
     </w:p>
     <w:p>
       <w:pPr>
@@ -19612,7 +21714,7 @@
           <w:lang w:val="uk-UA" w:eastAsia="ru-RU"/>
         </w:rPr>
       </w:pPr>
-      <w:bookmarkStart w:id="22" w:name="_Toc224694576"/>
+      <w:bookmarkStart w:id="25" w:name="_Toc224694576"/>
       <w:r>
         <w:rPr>
           <w:rFonts w:eastAsia="Arial Unicode MS" w:cs="Times New Roman"/>
@@ -19638,7 +21740,7 @@
         </w:rPr>
         <w:t>Назва додатку</w:t>
       </w:r>
-      <w:bookmarkEnd w:id="22"/>
+      <w:bookmarkEnd w:id="25"/>
     </w:p>
     <w:p>
       <w:pPr>
@@ -19682,7 +21784,7 @@
           <w:lang w:val="uk-UA" w:eastAsia="ru-RU"/>
         </w:rPr>
       </w:pPr>
-      <w:bookmarkStart w:id="23" w:name="_Toc224694577"/>
+      <w:bookmarkStart w:id="26" w:name="_Toc224694577"/>
       <w:r>
         <w:rPr>
           <w:rFonts w:eastAsia="Arial Unicode MS" w:cs="Times New Roman"/>
@@ -19708,7 +21810,7 @@
         </w:rPr>
         <w:t>Назва додатку</w:t>
       </w:r>
-      <w:bookmarkEnd w:id="23"/>
+      <w:bookmarkEnd w:id="26"/>
     </w:p>
     <w:p>
       <w:pPr>

</xml_diff>